<commit_message>
Strengthen proposal with verified related work and reproducible baseline pilot
</commit_message>
<xml_diff>
--- a/docx/IoT_Alert_Processing_Research_Proposal.docx
+++ b/docx/IoT_Alert_Processing_Research_Proposal.docx
@@ -38,7 +38,7 @@
     </w:p>
     <w:p>
       <w:r>
-        <w:t>Consider a monitoring gateway receiving device tampering alerts, repeated authentication failure alerts, and routine device status messages. During a burst, the processing queue can grow. The application must decide which waiting message to process next. Alert severity is supplied by a trusted test configuration; detecting attacks is outside this study.</w:t>
+        <w:t>The target is a building or small industrial gateway that enriches already-classified security events with device context and records an outcome. Tampering alerts are high priority, repeated authentication failures medium, and device health events low. During incident bursts, a single application worker may fall behind MQTT delivery. This is a bottleneck hypothesis to measure, not a measured deployment fact. The pilot uses synthetic class labels and a 10 ms processing cost; it does not detect attacks.</w:t>
       </w:r>
     </w:p>
     <w:p>
@@ -87,7 +87,7 @@
     </w:p>
     <w:p>
       <w:r>
-        <w:t>The scheduler operates in an application worker after MQTT delivery. It does not change the broker, transport protocol or MQTT delivery guarantees. The expected contribution is a clearly specified policy plus a reproducible evaluation of its operating limits. Aging and priority scheduling are established ideas. Algorithmic novelty remains a hypothesis until a focused related-work comparison is complete. No hard real-time guarantee or publication outcome is assumed.</w:t>
+        <w:t>The scheduler runs after MQTT delivery. Its proposed contribution is an empirically tested decision rule for balancing urgent deadlines and routine waiting at a bounded application queue. Existing MQTT work already addresses priority and fairness, including R8. Queue location alone does not establish novelty. Full comparison with the closest prior work is required before freezing an algorithmic contribution. No hard timing guarantee is claimed.</w:t>
       </w:r>
     </w:p>
     <w:p>
@@ -101,12 +101,12 @@
     </w:p>
     <w:p>
       <w:r>
-        <w:t>The pipeline contains a configurable event generator, a Mosquitto broker, a validating receiver, a bounded scheduling queue, one processing worker and a metrics recorder. A separate discrete-event simulator supports repeatable tests. Both paths will use the same policy interface and workload configuration wherever practical.</w:t>
+        <w:t>The planned pipeline contains an event generator, unmodified Mosquitto broker, validating receiver, bounded queue, one enrichment worker and a metrics recorder. Instrument broker forwarding, enqueue, queue residence and processing separately. Proceed with the worker-queue claim only if that stage is a material bottleneck. The current pilot uses an unbounded queue; bounded admission remains future implementation.</w:t>
       </w:r>
     </w:p>
     <w:p>
       <w:r>
-        <w:t>Each event carries event_id, device_id, event_type, severity, creation time and a configured relative deadline. The receiver assigns an arrival sequence and local monotonic timestamps. Deadlines are application requirements supplied by the experiment, not security properties derived from MQTT QoS.</w:t>
+        <w:t>Planned event fields are event_id, device_id, event_type, trusted severity, creation time and relative deadline. Receiver-local timestamps use a monotonic clock. The 100, 500 and 2000 ms deadlines are illustrative service budgets, not field requirements. Validate them with an operator and sweep them in sensitivity tests. See docs/application-scenario.md for the measurement and trust boundaries.</w:t>
       </w:r>
     </w:p>
     <w:tbl>
@@ -1311,32 +1311,2046 @@
         <w:pageBreakBefore/>
       </w:pPr>
       <w:r>
-        <w:t>Initial reference foundation</w:t>
+        <w:t>Related work on priority and delivery</w:t>
       </w:r>
     </w:p>
     <w:p>
       <w:r>
-        <w:t>[1] C. L. Liu and James W. Layland. 1973. Scheduling Algorithms for Multiprogramming in a Hard-Real-Time Environment. Journal of the ACM, 20(1), 46–61. Publisher: Association for Computing Machinery. DOI: 10.1145/321738.321743. https://dl.acm.org/doi/10.1145/321738.321743</w:t>
+        <w:t>The focused review below uses eight verified publications from 2019 to 2026. Verification concerns identity and bibliographic details; some full texts were unavailable. Abstract-based comparisons are explicitly limited. This is not a systematic review or a ranking of publication venues.</w:t>
+      </w:r>
+    </w:p>
+    <w:tbl>
+      <w:tblPr>
+        <w:tblW w:type="auto" w:w="0"/>
+        <w:tblLayout w:type="fixed"/>
+        <w:tblLook w:firstColumn="1" w:firstRow="1" w:lastColumn="0" w:lastRow="0" w:noHBand="0" w:noVBand="1" w:val="04A0"/>
+      </w:tblPr>
+      <w:tblGrid>
+        <w:gridCol w:w="936"/>
+        <w:gridCol w:w="3240"/>
+        <w:gridCol w:w="5760"/>
+      </w:tblGrid>
+      <w:tr>
+        <w:trPr>
+          <w:cantSplit/>
+          <w:tblHeader/>
+        </w:trPr>
+        <w:tc>
+          <w:tcPr>
+            <w:tcW w:type="dxa" w:w="936"/>
+            <w:tcBorders>
+              <w:top w:val="single" w:color="D9D9D9" w:sz="4"/>
+              <w:bottom w:val="single" w:color="D9D9D9" w:sz="4"/>
+              <w:left w:val="single" w:color="D9D9D9" w:sz="4"/>
+              <w:right w:val="single" w:color="D9D9D9" w:sz="4"/>
+            </w:tcBorders>
+            <w:shd w:fill="E8EEF4"/>
+          </w:tcPr>
+          <w:p>
+            <w:pPr>
+              <w:spacing w:before="100" w:after="100"/>
+            </w:pPr>
+            <w:r>
+              <w:rPr>
+                <w:b/>
+                <w:sz w:val="20"/>
+              </w:rPr>
+              <w:t>Study</w:t>
+            </w:r>
+          </w:p>
+        </w:tc>
+        <w:tc>
+          <w:tcPr>
+            <w:tcW w:type="dxa" w:w="3240"/>
+            <w:tcBorders>
+              <w:top w:val="single" w:color="D9D9D9" w:sz="4"/>
+              <w:bottom w:val="single" w:color="D9D9D9" w:sz="4"/>
+              <w:left w:val="single" w:color="D9D9D9" w:sz="4"/>
+              <w:right w:val="single" w:color="D9D9D9" w:sz="4"/>
+            </w:tcBorders>
+            <w:shd w:fill="E8EEF4"/>
+          </w:tcPr>
+          <w:p>
+            <w:pPr>
+              <w:spacing w:before="100" w:after="100"/>
+            </w:pPr>
+            <w:r>
+              <w:rPr>
+                <w:b/>
+                <w:sz w:val="20"/>
+              </w:rPr>
+              <w:t>Established approach</w:t>
+            </w:r>
+          </w:p>
+        </w:tc>
+        <w:tc>
+          <w:tcPr>
+            <w:tcW w:type="dxa" w:w="5760"/>
+            <w:tcBorders>
+              <w:top w:val="single" w:color="D9D9D9" w:sz="4"/>
+              <w:bottom w:val="single" w:color="D9D9D9" w:sz="4"/>
+              <w:left w:val="single" w:color="D9D9D9" w:sz="4"/>
+              <w:right w:val="single" w:color="D9D9D9" w:sz="4"/>
+            </w:tcBorders>
+            <w:shd w:fill="E8EEF4"/>
+          </w:tcPr>
+          <w:p>
+            <w:pPr>
+              <w:spacing w:before="100" w:after="100"/>
+            </w:pPr>
+            <w:r>
+              <w:rPr>
+                <w:b/>
+                <w:sz w:val="20"/>
+              </w:rPr>
+              <w:t>Implication for this project</w:t>
+            </w:r>
+          </w:p>
+        </w:tc>
+      </w:tr>
+      <w:tr>
+        <w:trPr>
+          <w:cantSplit/>
+        </w:trPr>
+        <w:tc>
+          <w:tcPr>
+            <w:tcW w:type="dxa" w:w="936"/>
+            <w:tcBorders>
+              <w:top w:val="single" w:color="D9D9D9" w:sz="4"/>
+              <w:bottom w:val="single" w:color="D9D9D9" w:sz="4"/>
+              <w:left w:val="single" w:color="D9D9D9" w:sz="4"/>
+              <w:right w:val="single" w:color="D9D9D9" w:sz="4"/>
+            </w:tcBorders>
+          </w:tcPr>
+          <w:p>
+            <w:pPr>
+              <w:spacing w:before="100" w:after="100"/>
+            </w:pPr>
+            <w:r>
+              <w:rPr>
+                <w:b w:val="0"/>
+                <w:sz w:val="20"/>
+              </w:rPr>
+              <w:t>R1 2024</w:t>
+            </w:r>
+          </w:p>
+        </w:tc>
+        <w:tc>
+          <w:tcPr>
+            <w:tcW w:type="dxa" w:w="3240"/>
+            <w:tcBorders>
+              <w:top w:val="single" w:color="D9D9D9" w:sz="4"/>
+              <w:bottom w:val="single" w:color="D9D9D9" w:sz="4"/>
+              <w:left w:val="single" w:color="D9D9D9" w:sz="4"/>
+              <w:right w:val="single" w:color="D9D9D9" w:sz="4"/>
+            </w:tcBorders>
+          </w:tcPr>
+          <w:p>
+            <w:pPr>
+              <w:spacing w:before="100" w:after="100"/>
+            </w:pPr>
+            <w:r>
+              <w:rPr>
+                <w:b w:val="0"/>
+                <w:sz w:val="20"/>
+              </w:rPr>
+              <w:t>Prioritizes time-critical traffic using a UDP-based MQTT extension.</w:t>
+            </w:r>
+          </w:p>
+        </w:tc>
+        <w:tc>
+          <w:tcPr>
+            <w:tcW w:type="dxa" w:w="5760"/>
+            <w:tcBorders>
+              <w:top w:val="single" w:color="D9D9D9" w:sz="4"/>
+              <w:bottom w:val="single" w:color="D9D9D9" w:sz="4"/>
+              <w:left w:val="single" w:color="D9D9D9" w:sz="4"/>
+              <w:right w:val="single" w:color="D9D9D9" w:sz="4"/>
+            </w:tcBorders>
+          </w:tcPr>
+          <w:p>
+            <w:pPr>
+              <w:spacing w:before="100" w:after="100"/>
+            </w:pPr>
+            <w:r>
+              <w:rPr>
+                <w:b w:val="0"/>
+                <w:sz w:val="20"/>
+              </w:rPr>
+              <w:t>Transport and protocol intervention; our queue is after delivery. No direct performance comparison is valid without matching the network model.</w:t>
+            </w:r>
+          </w:p>
+        </w:tc>
+      </w:tr>
+      <w:tr>
+        <w:trPr>
+          <w:cantSplit/>
+        </w:trPr>
+        <w:tc>
+          <w:tcPr>
+            <w:tcW w:type="dxa" w:w="936"/>
+            <w:tcBorders>
+              <w:top w:val="single" w:color="D9D9D9" w:sz="4"/>
+              <w:bottom w:val="single" w:color="D9D9D9" w:sz="4"/>
+              <w:left w:val="single" w:color="D9D9D9" w:sz="4"/>
+              <w:right w:val="single" w:color="D9D9D9" w:sz="4"/>
+            </w:tcBorders>
+          </w:tcPr>
+          <w:p>
+            <w:pPr>
+              <w:spacing w:before="100" w:after="100"/>
+            </w:pPr>
+            <w:r>
+              <w:rPr>
+                <w:b w:val="0"/>
+                <w:sz w:val="20"/>
+              </w:rPr>
+              <w:t>R2 2024</w:t>
+            </w:r>
+          </w:p>
+        </w:tc>
+        <w:tc>
+          <w:tcPr>
+            <w:tcW w:type="dxa" w:w="3240"/>
+            <w:tcBorders>
+              <w:top w:val="single" w:color="D9D9D9" w:sz="4"/>
+              <w:bottom w:val="single" w:color="D9D9D9" w:sz="4"/>
+              <w:left w:val="single" w:color="D9D9D9" w:sz="4"/>
+              <w:right w:val="single" w:color="D9D9D9" w:sz="4"/>
+            </w:tcBorders>
+          </w:tcPr>
+          <w:p>
+            <w:pPr>
+              <w:spacing w:before="100" w:after="100"/>
+            </w:pPr>
+            <w:r>
+              <w:rPr>
+                <w:b w:val="0"/>
+                <w:sz w:val="20"/>
+              </w:rPr>
+              <w:t>RabbitMQ virtual queues distinguish urgent, critical and FCFS messages.</w:t>
+            </w:r>
+          </w:p>
+        </w:tc>
+        <w:tc>
+          <w:tcPr>
+            <w:tcW w:type="dxa" w:w="5760"/>
+            <w:tcBorders>
+              <w:top w:val="single" w:color="D9D9D9" w:sz="4"/>
+              <w:bottom w:val="single" w:color="D9D9D9" w:sz="4"/>
+              <w:left w:val="single" w:color="D9D9D9" w:sz="4"/>
+              <w:right w:val="single" w:color="D9D9D9" w:sz="4"/>
+            </w:tcBorders>
+          </w:tcPr>
+          <w:p>
+            <w:pPr>
+              <w:spacing w:before="100" w:after="100"/>
+            </w:pPr>
+            <w:r>
+              <w:rPr>
+                <w:b w:val="0"/>
+                <w:sz w:val="20"/>
+              </w:rPr>
+              <w:t>Shows that emergency priority queues already exist. We will examine routine waiting and repeated overload rather than claim priority support itself as new.</w:t>
+            </w:r>
+          </w:p>
+        </w:tc>
+      </w:tr>
+      <w:tr>
+        <w:trPr>
+          <w:cantSplit/>
+        </w:trPr>
+        <w:tc>
+          <w:tcPr>
+            <w:tcW w:type="dxa" w:w="936"/>
+            <w:tcBorders>
+              <w:top w:val="single" w:color="D9D9D9" w:sz="4"/>
+              <w:bottom w:val="single" w:color="D9D9D9" w:sz="4"/>
+              <w:left w:val="single" w:color="D9D9D9" w:sz="4"/>
+              <w:right w:val="single" w:color="D9D9D9" w:sz="4"/>
+            </w:tcBorders>
+          </w:tcPr>
+          <w:p>
+            <w:pPr>
+              <w:spacing w:before="100" w:after="100"/>
+            </w:pPr>
+            <w:r>
+              <w:rPr>
+                <w:b w:val="0"/>
+                <w:sz w:val="20"/>
+              </w:rPr>
+              <w:t>R3 2024</w:t>
+            </w:r>
+          </w:p>
+        </w:tc>
+        <w:tc>
+          <w:tcPr>
+            <w:tcW w:type="dxa" w:w="3240"/>
+            <w:tcBorders>
+              <w:top w:val="single" w:color="D9D9D9" w:sz="4"/>
+              <w:bottom w:val="single" w:color="D9D9D9" w:sz="4"/>
+              <w:left w:val="single" w:color="D9D9D9" w:sz="4"/>
+              <w:right w:val="single" w:color="D9D9D9" w:sz="4"/>
+            </w:tcBorders>
+          </w:tcPr>
+          <w:p>
+            <w:pPr>
+              <w:spacing w:before="100" w:after="100"/>
+            </w:pPr>
+            <w:r>
+              <w:rPr>
+                <w:b w:val="0"/>
+                <w:sz w:val="20"/>
+              </w:rPr>
+              <w:t>Combines selective transmission and urgent-message processing in HBMQTT.</w:t>
+            </w:r>
+          </w:p>
+        </w:tc>
+        <w:tc>
+          <w:tcPr>
+            <w:tcW w:type="dxa" w:w="5760"/>
+            <w:tcBorders>
+              <w:top w:val="single" w:color="D9D9D9" w:sz="4"/>
+              <w:bottom w:val="single" w:color="D9D9D9" w:sz="4"/>
+              <w:left w:val="single" w:color="D9D9D9" w:sz="4"/>
+              <w:right w:val="single" w:color="D9D9D9" w:sz="4"/>
+            </w:tcBorders>
+          </w:tcPr>
+          <w:p>
+            <w:pPr>
+              <w:spacing w:before="100" w:after="100"/>
+            </w:pPr>
+            <w:r>
+              <w:rPr>
+                <w:b w:val="0"/>
+                <w:sz w:val="20"/>
+              </w:rPr>
+              <w:t>Traffic suppression changes the offered workload; our initial comparisons keep identical input traces. Full text is needed before making absence claims.</w:t>
+            </w:r>
+          </w:p>
+        </w:tc>
+      </w:tr>
+      <w:tr>
+        <w:trPr>
+          <w:cantSplit/>
+        </w:trPr>
+        <w:tc>
+          <w:tcPr>
+            <w:tcW w:type="dxa" w:w="936"/>
+            <w:tcBorders>
+              <w:top w:val="single" w:color="D9D9D9" w:sz="4"/>
+              <w:bottom w:val="single" w:color="D9D9D9" w:sz="4"/>
+              <w:left w:val="single" w:color="D9D9D9" w:sz="4"/>
+              <w:right w:val="single" w:color="D9D9D9" w:sz="4"/>
+            </w:tcBorders>
+          </w:tcPr>
+          <w:p>
+            <w:pPr>
+              <w:spacing w:before="100" w:after="100"/>
+            </w:pPr>
+            <w:r>
+              <w:rPr>
+                <w:b w:val="0"/>
+                <w:sz w:val="20"/>
+              </w:rPr>
+              <w:t>R4 2024</w:t>
+            </w:r>
+          </w:p>
+        </w:tc>
+        <w:tc>
+          <w:tcPr>
+            <w:tcW w:type="dxa" w:w="3240"/>
+            <w:tcBorders>
+              <w:top w:val="single" w:color="D9D9D9" w:sz="4"/>
+              <w:bottom w:val="single" w:color="D9D9D9" w:sz="4"/>
+              <w:left w:val="single" w:color="D9D9D9" w:sz="4"/>
+              <w:right w:val="single" w:color="D9D9D9" w:sz="4"/>
+            </w:tcBorders>
+          </w:tcPr>
+          <w:p>
+            <w:pPr>
+              <w:spacing w:before="100" w:after="100"/>
+            </w:pPr>
+            <w:r>
+              <w:rPr>
+                <w:b w:val="0"/>
+                <w:sz w:val="20"/>
+              </w:rPr>
+              <w:t>Explores integrating PrioMQTT with TSN for traffic with diverse timing needs.</w:t>
+            </w:r>
+          </w:p>
+        </w:tc>
+        <w:tc>
+          <w:tcPr>
+            <w:tcW w:type="dxa" w:w="5760"/>
+            <w:tcBorders>
+              <w:top w:val="single" w:color="D9D9D9" w:sz="4"/>
+              <w:bottom w:val="single" w:color="D9D9D9" w:sz="4"/>
+              <w:left w:val="single" w:color="D9D9D9" w:sz="4"/>
+              <w:right w:val="single" w:color="D9D9D9" w:sz="4"/>
+            </w:tcBorders>
+          </w:tcPr>
+          <w:p>
+            <w:pPr>
+              <w:spacing w:before="100" w:after="100"/>
+            </w:pPr>
+            <w:r>
+              <w:rPr>
+                <w:b w:val="0"/>
+                <w:sz w:val="20"/>
+              </w:rPr>
+              <w:t>Network support matters for timing bounds. We make no network-level deadline guarantee from an application queue.</w:t>
+            </w:r>
+          </w:p>
+        </w:tc>
+      </w:tr>
+    </w:tbl>
+    <w:p>
+      <w:pPr>
+        <w:spacing w:after="40"/>
+      </w:pPr>
+    </w:p>
+    <w:p>
+      <w:pPr>
+        <w:pStyle w:val="Heading2"/>
+      </w:pPr>
+      <w:r>
+        <w:t>What is already established</w:t>
       </w:r>
     </w:p>
     <w:p>
       <w:r>
-        <w:t>Relevance: provides foundational real-time scheduling context. Its task assumptions and guarantees do not transfer automatically to this non-preemptive MQTT application.</w:t>
+        <w:t>Priority MQTT, separate urgency queues and low-delay delivery are existing research directions. R1 changes transport behavior, R2 uses virtual urgency queues, R3 combines prioritization with traffic reduction, and R4 considers TSN integration. A project that only adds priority to MQTT would overlap these directions.</w:t>
+      </w:r>
+    </w:p>
+    <w:p>
+      <w:pPr>
+        <w:pStyle w:val="Heading2"/>
+      </w:pPr>
+      <w:r>
+        <w:t>Evidence limits</w:t>
       </w:r>
     </w:p>
     <w:p>
       <w:r>
-        <w:t>[2] Andrew Banks, Ed Briggs, Ken Borgendale and Rahul Gupta, editors. 2019. MQTT Version 5.0. OASIS Standard, 7 March 2019. Publisher: OASIS Open. https://docs.oasis-open.org/mqtt/mqtt/v5.0/os/mqtt-v5.0-os.html</w:t>
+        <w:t>R2 was reviewed in full publisher text. R1 and R3 comparisons rely on publisher abstracts and metadata; R4 uses the publisher abstract and indexed author text. These records support the stated approach, not broad claims about every experiment or missing feature. Detailed verification notes and official links are in docs/related-work.md.</w:t>
+      </w:r>
+    </w:p>
+    <w:p>
+      <w:pPr>
+        <w:pStyle w:val="Heading1"/>
+        <w:pageBreakBefore/>
+      </w:pPr>
+      <w:r>
+        <w:t>Related work on timing and fairness</w:t>
+      </w:r>
+    </w:p>
+    <w:tbl>
+      <w:tblPr>
+        <w:tblW w:type="auto" w:w="0"/>
+        <w:tblLayout w:type="fixed"/>
+        <w:tblLook w:firstColumn="1" w:firstRow="1" w:lastColumn="0" w:lastRow="0" w:noHBand="0" w:noVBand="1" w:val="04A0"/>
+      </w:tblPr>
+      <w:tblGrid>
+        <w:gridCol w:w="936"/>
+        <w:gridCol w:w="3240"/>
+        <w:gridCol w:w="5760"/>
+      </w:tblGrid>
+      <w:tr>
+        <w:trPr>
+          <w:cantSplit/>
+          <w:tblHeader/>
+        </w:trPr>
+        <w:tc>
+          <w:tcPr>
+            <w:tcW w:type="dxa" w:w="936"/>
+            <w:tcBorders>
+              <w:top w:val="single" w:color="D9D9D9" w:sz="4"/>
+              <w:bottom w:val="single" w:color="D9D9D9" w:sz="4"/>
+              <w:left w:val="single" w:color="D9D9D9" w:sz="4"/>
+              <w:right w:val="single" w:color="D9D9D9" w:sz="4"/>
+            </w:tcBorders>
+            <w:shd w:fill="E8EEF4"/>
+          </w:tcPr>
+          <w:p>
+            <w:pPr>
+              <w:spacing w:before="100" w:after="100"/>
+            </w:pPr>
+            <w:r>
+              <w:rPr>
+                <w:b/>
+                <w:sz w:val="20"/>
+              </w:rPr>
+              <w:t>Study</w:t>
+            </w:r>
+          </w:p>
+        </w:tc>
+        <w:tc>
+          <w:tcPr>
+            <w:tcW w:type="dxa" w:w="3240"/>
+            <w:tcBorders>
+              <w:top w:val="single" w:color="D9D9D9" w:sz="4"/>
+              <w:bottom w:val="single" w:color="D9D9D9" w:sz="4"/>
+              <w:left w:val="single" w:color="D9D9D9" w:sz="4"/>
+              <w:right w:val="single" w:color="D9D9D9" w:sz="4"/>
+            </w:tcBorders>
+            <w:shd w:fill="E8EEF4"/>
+          </w:tcPr>
+          <w:p>
+            <w:pPr>
+              <w:spacing w:before="100" w:after="100"/>
+            </w:pPr>
+            <w:r>
+              <w:rPr>
+                <w:b/>
+                <w:sz w:val="20"/>
+              </w:rPr>
+              <w:t>Established approach</w:t>
+            </w:r>
+          </w:p>
+        </w:tc>
+        <w:tc>
+          <w:tcPr>
+            <w:tcW w:type="dxa" w:w="5760"/>
+            <w:tcBorders>
+              <w:top w:val="single" w:color="D9D9D9" w:sz="4"/>
+              <w:bottom w:val="single" w:color="D9D9D9" w:sz="4"/>
+              <w:left w:val="single" w:color="D9D9D9" w:sz="4"/>
+              <w:right w:val="single" w:color="D9D9D9" w:sz="4"/>
+            </w:tcBorders>
+            <w:shd w:fill="E8EEF4"/>
+          </w:tcPr>
+          <w:p>
+            <w:pPr>
+              <w:spacing w:before="100" w:after="100"/>
+            </w:pPr>
+            <w:r>
+              <w:rPr>
+                <w:b/>
+                <w:sz w:val="20"/>
+              </w:rPr>
+              <w:t>Implication for this project</w:t>
+            </w:r>
+          </w:p>
+        </w:tc>
+      </w:tr>
+      <w:tr>
+        <w:trPr>
+          <w:cantSplit/>
+        </w:trPr>
+        <w:tc>
+          <w:tcPr>
+            <w:tcW w:type="dxa" w:w="936"/>
+            <w:tcBorders>
+              <w:top w:val="single" w:color="D9D9D9" w:sz="4"/>
+              <w:bottom w:val="single" w:color="D9D9D9" w:sz="4"/>
+              <w:left w:val="single" w:color="D9D9D9" w:sz="4"/>
+              <w:right w:val="single" w:color="D9D9D9" w:sz="4"/>
+            </w:tcBorders>
+          </w:tcPr>
+          <w:p>
+            <w:pPr>
+              <w:spacing w:before="100" w:after="100"/>
+            </w:pPr>
+            <w:r>
+              <w:rPr>
+                <w:b w:val="0"/>
+                <w:sz w:val="20"/>
+              </w:rPr>
+              <w:t>R5 2022</w:t>
+            </w:r>
+          </w:p>
+        </w:tc>
+        <w:tc>
+          <w:tcPr>
+            <w:tcW w:type="dxa" w:w="3240"/>
+            <w:tcBorders>
+              <w:top w:val="single" w:color="D9D9D9" w:sz="4"/>
+              <w:bottom w:val="single" w:color="D9D9D9" w:sz="4"/>
+              <w:left w:val="single" w:color="D9D9D9" w:sz="4"/>
+              <w:right w:val="single" w:color="D9D9D9" w:sz="4"/>
+            </w:tcBorders>
+          </w:tcPr>
+          <w:p>
+            <w:pPr>
+              <w:spacing w:before="100" w:after="100"/>
+            </w:pPr>
+            <w:r>
+              <w:rPr>
+                <w:b w:val="0"/>
+                <w:sz w:val="20"/>
+              </w:rPr>
+              <w:t>Maps application timing requirements to SDN resource reservations.</w:t>
+            </w:r>
+          </w:p>
+        </w:tc>
+        <w:tc>
+          <w:tcPr>
+            <w:tcW w:type="dxa" w:w="5760"/>
+            <w:tcBorders>
+              <w:top w:val="single" w:color="D9D9D9" w:sz="4"/>
+              <w:bottom w:val="single" w:color="D9D9D9" w:sz="4"/>
+              <w:left w:val="single" w:color="D9D9D9" w:sz="4"/>
+              <w:right w:val="single" w:color="D9D9D9" w:sz="4"/>
+            </w:tcBorders>
+          </w:tcPr>
+          <w:p>
+            <w:pPr>
+              <w:spacing w:before="100" w:after="100"/>
+            </w:pPr>
+            <w:r>
+              <w:rPr>
+                <w:b w:val="0"/>
+                <w:sz w:val="20"/>
+              </w:rPr>
+              <w:t>A broader architecture than our worker queue. Its treatment of ordinary-traffic cost motivates reporting both event classes.</w:t>
+            </w:r>
+          </w:p>
+        </w:tc>
+      </w:tr>
+      <w:tr>
+        <w:trPr>
+          <w:cantSplit/>
+        </w:trPr>
+        <w:tc>
+          <w:tcPr>
+            <w:tcW w:type="dxa" w:w="936"/>
+            <w:tcBorders>
+              <w:top w:val="single" w:color="D9D9D9" w:sz="4"/>
+              <w:bottom w:val="single" w:color="D9D9D9" w:sz="4"/>
+              <w:left w:val="single" w:color="D9D9D9" w:sz="4"/>
+              <w:right w:val="single" w:color="D9D9D9" w:sz="4"/>
+            </w:tcBorders>
+          </w:tcPr>
+          <w:p>
+            <w:pPr>
+              <w:spacing w:before="100" w:after="100"/>
+            </w:pPr>
+            <w:r>
+              <w:rPr>
+                <w:b w:val="0"/>
+                <w:sz w:val="20"/>
+              </w:rPr>
+              <w:t>R6 2023</w:t>
+            </w:r>
+          </w:p>
+        </w:tc>
+        <w:tc>
+          <w:tcPr>
+            <w:tcW w:type="dxa" w:w="3240"/>
+            <w:tcBorders>
+              <w:top w:val="single" w:color="D9D9D9" w:sz="4"/>
+              <w:bottom w:val="single" w:color="D9D9D9" w:sz="4"/>
+              <w:left w:val="single" w:color="D9D9D9" w:sz="4"/>
+              <w:right w:val="single" w:color="D9D9D9" w:sz="4"/>
+            </w:tcBorders>
+          </w:tcPr>
+          <w:p>
+            <w:pPr>
+              <w:spacing w:before="100" w:after="100"/>
+            </w:pPr>
+            <w:r>
+              <w:rPr>
+                <w:b w:val="0"/>
+                <w:sz w:val="20"/>
+              </w:rPr>
+              <w:t>Derives worst-case response-time analysis for an SDN-based MQTT architecture.</w:t>
+            </w:r>
+          </w:p>
+        </w:tc>
+        <w:tc>
+          <w:tcPr>
+            <w:tcW w:type="dxa" w:w="5760"/>
+            <w:tcBorders>
+              <w:top w:val="single" w:color="D9D9D9" w:sz="4"/>
+              <w:bottom w:val="single" w:color="D9D9D9" w:sz="4"/>
+              <w:left w:val="single" w:color="D9D9D9" w:sz="4"/>
+              <w:right w:val="single" w:color="D9D9D9" w:sz="4"/>
+            </w:tcBorders>
+          </w:tcPr>
+          <w:p>
+            <w:pPr>
+              <w:spacing w:before="100" w:after="100"/>
+            </w:pPr>
+            <w:r>
+              <w:rPr>
+                <w:b w:val="0"/>
+                <w:sz w:val="20"/>
+              </w:rPr>
+              <w:t>A formal guarantee requires an explicit analyzable model. Our initial results are empirical finite-workload measurements.</w:t>
+            </w:r>
+          </w:p>
+        </w:tc>
+      </w:tr>
+      <w:tr>
+        <w:trPr>
+          <w:cantSplit/>
+        </w:trPr>
+        <w:tc>
+          <w:tcPr>
+            <w:tcW w:type="dxa" w:w="936"/>
+            <w:tcBorders>
+              <w:top w:val="single" w:color="D9D9D9" w:sz="4"/>
+              <w:bottom w:val="single" w:color="D9D9D9" w:sz="4"/>
+              <w:left w:val="single" w:color="D9D9D9" w:sz="4"/>
+              <w:right w:val="single" w:color="D9D9D9" w:sz="4"/>
+            </w:tcBorders>
+          </w:tcPr>
+          <w:p>
+            <w:pPr>
+              <w:spacing w:before="100" w:after="100"/>
+            </w:pPr>
+            <w:r>
+              <w:rPr>
+                <w:b w:val="0"/>
+                <w:sz w:val="20"/>
+              </w:rPr>
+              <w:t>R7 2019</w:t>
+            </w:r>
+          </w:p>
+        </w:tc>
+        <w:tc>
+          <w:tcPr>
+            <w:tcW w:type="dxa" w:w="3240"/>
+            <w:tcBorders>
+              <w:top w:val="single" w:color="D9D9D9" w:sz="4"/>
+              <w:bottom w:val="single" w:color="D9D9D9" w:sz="4"/>
+              <w:left w:val="single" w:color="D9D9D9" w:sz="4"/>
+              <w:right w:val="single" w:color="D9D9D9" w:sz="4"/>
+            </w:tcBorders>
+          </w:tcPr>
+          <w:p>
+            <w:pPr>
+              <w:spacing w:before="100" w:after="100"/>
+            </w:pPr>
+            <w:r>
+              <w:rPr>
+                <w:b w:val="0"/>
+                <w:sz w:val="20"/>
+              </w:rPr>
+              <w:t>Modifies Mosquitto for urgent message delivery.</w:t>
+            </w:r>
+          </w:p>
+        </w:tc>
+        <w:tc>
+          <w:tcPr>
+            <w:tcW w:type="dxa" w:w="5760"/>
+            <w:tcBorders>
+              <w:top w:val="single" w:color="D9D9D9" w:sz="4"/>
+              <w:bottom w:val="single" w:color="D9D9D9" w:sz="4"/>
+              <w:left w:val="single" w:color="D9D9D9" w:sz="4"/>
+              <w:right w:val="single" w:color="D9D9D9" w:sz="4"/>
+            </w:tcBorders>
+          </w:tcPr>
+          <w:p>
+            <w:pPr>
+              <w:spacing w:before="100" w:after="100"/>
+            </w:pPr>
+            <w:r>
+              <w:rPr>
+                <w:b w:val="0"/>
+                <w:sz w:val="20"/>
+              </w:rPr>
+              <w:t>Prior art for broker-level urgency. Detailed algorithm and evaluation limitations remain unassessed because full text was unavailable.</w:t>
+            </w:r>
+          </w:p>
+        </w:tc>
+      </w:tr>
+      <w:tr>
+        <w:trPr>
+          <w:cantSplit/>
+        </w:trPr>
+        <w:tc>
+          <w:tcPr>
+            <w:tcW w:type="dxa" w:w="936"/>
+            <w:tcBorders>
+              <w:top w:val="single" w:color="D9D9D9" w:sz="4"/>
+              <w:bottom w:val="single" w:color="D9D9D9" w:sz="4"/>
+              <w:left w:val="single" w:color="D9D9D9" w:sz="4"/>
+              <w:right w:val="single" w:color="D9D9D9" w:sz="4"/>
+            </w:tcBorders>
+          </w:tcPr>
+          <w:p>
+            <w:pPr>
+              <w:spacing w:before="100" w:after="100"/>
+            </w:pPr>
+            <w:r>
+              <w:rPr>
+                <w:b w:val="0"/>
+                <w:sz w:val="20"/>
+              </w:rPr>
+              <w:t>R8 2026</w:t>
+            </w:r>
+          </w:p>
+        </w:tc>
+        <w:tc>
+          <w:tcPr>
+            <w:tcW w:type="dxa" w:w="3240"/>
+            <w:tcBorders>
+              <w:top w:val="single" w:color="D9D9D9" w:sz="4"/>
+              <w:bottom w:val="single" w:color="D9D9D9" w:sz="4"/>
+              <w:left w:val="single" w:color="D9D9D9" w:sz="4"/>
+              <w:right w:val="single" w:color="D9D9D9" w:sz="4"/>
+            </w:tcBorders>
+          </w:tcPr>
+          <w:p>
+            <w:pPr>
+              <w:spacing w:before="100" w:after="100"/>
+            </w:pPr>
+            <w:r>
+              <w:rPr>
+                <w:b w:val="0"/>
+                <w:sz w:val="20"/>
+              </w:rPr>
+              <w:t>TRIAGE/4 combines semantic alarm priority and device fairness with simulation and an MQTT prototype.</w:t>
+            </w:r>
+          </w:p>
+        </w:tc>
+        <w:tc>
+          <w:tcPr>
+            <w:tcW w:type="dxa" w:w="5760"/>
+            <w:tcBorders>
+              <w:top w:val="single" w:color="D9D9D9" w:sz="4"/>
+              <w:bottom w:val="single" w:color="D9D9D9" w:sz="4"/>
+              <w:left w:val="single" w:color="D9D9D9" w:sz="4"/>
+              <w:right w:val="single" w:color="D9D9D9" w:sz="4"/>
+            </w:tcBorders>
+          </w:tcPr>
+          <w:p>
+            <w:pPr>
+              <w:spacing w:before="100" w:after="100"/>
+            </w:pPr>
+            <w:r>
+              <w:rPr>
+                <w:b w:val="0"/>
+                <w:sz w:val="20"/>
+              </w:rPr>
+              <w:t>Closest conceptual overlap: alarm latency and fairness are already studied. Any novelty claim needs a full comparison with this method, not just FIFO and strict priority.</w:t>
+            </w:r>
+          </w:p>
+        </w:tc>
+      </w:tr>
+    </w:tbl>
+    <w:p>
+      <w:pPr>
+        <w:spacing w:after="40"/>
+      </w:pPr>
+    </w:p>
+    <w:p>
+      <w:pPr>
+        <w:pStyle w:val="Heading2"/>
+      </w:pPr>
+      <w:r>
+        <w:t>Candidate gap and design decision</w:t>
       </w:r>
     </w:p>
     <w:p>
       <w:r>
-        <w:t>Relevance: defines MQTT messaging and delivery semantics. The current prototype uses the client default MQTT 3.1.1; protocol version and QoS will be explicitly fixed for evaluation.</w:t>
+        <w:t>For a bounded, non-preemptive worker after MQTT delivery, we will test whether occupancy-dependent aging improves the urgent-deadline versus routine-waiting tradeoff beyond tuned fixed aging and EDF, including dispatch overhead and lost work. This is a candidate empirical gap, not proof of absence in prior work.</w:t>
       </w:r>
     </w:p>
     <w:p>
       <w:r>
-        <w:t>Before freezing the policy, extend the literature matrix with recent verified MQTT priority, deadline and fairness studies. Compare decision rules, queue location, workloads and limitations. This foundation does not establish a unique research gap.</w:t>
+        <w:t>R8 is the closest conceptual overlap because it already combines alarm priority and fairness. Obtain its full algorithm, then reproduce a relevant policy or justify why its model is incompatible with this queue. Consider a fair-share baseline if device monopolization is studied. If the candidate remains only a rearrangement of existing ideas, redesign the contribution or pursue a distinct empirical finding.</w:t>
+      </w:r>
+    </w:p>
+    <w:p>
+      <w:r>
+        <w:t>R5 was read as a full author article in PMC; R6 was checked through its publisher record and abstract. R7 is a bibliographic prior-art check, not a full methodological appraisal. R8 uses its publisher abstract and author publication list. No absence claim is made from inaccessible text.</w:t>
+      </w:r>
+    </w:p>
+    <w:p>
+      <w:pPr>
+        <w:pStyle w:val="Heading1"/>
+        <w:pageBreakBefore/>
+      </w:pPr>
+      <w:r>
+        <w:t>Baseline pilot and observed tradeoffs</w:t>
+      </w:r>
+    </w:p>
+    <w:p>
+      <w:r>
+        <w:t>A completed pilot compared FIFO, strict priority and fixed aging using ten paired seeds, 1000 events per trace and arrival rates of 50, 90 and 120 events/s. This yields 90 policy runs and 90000 completed event records. Service is constant at 10 ms; aging promotes one class per 100 ms. Each queue is unbounded and drains after arrivals stop. No candidate adaptive method was tested.</w:t>
+      </w:r>
+    </w:p>
+    <w:tbl>
+      <w:tblPr>
+        <w:tblW w:type="auto" w:w="0"/>
+        <w:tblLayout w:type="fixed"/>
+        <w:tblLook w:firstColumn="1" w:firstRow="1" w:lastColumn="0" w:lastRow="0" w:noHBand="0" w:noVBand="1" w:val="04A0"/>
+      </w:tblPr>
+      <w:tblGrid>
+        <w:gridCol w:w="1584"/>
+        <w:gridCol w:w="2448"/>
+        <w:gridCol w:w="2952"/>
+        <w:gridCol w:w="2952"/>
+      </w:tblGrid>
+      <w:tr>
+        <w:trPr>
+          <w:cantSplit/>
+          <w:tblHeader/>
+        </w:trPr>
+        <w:tc>
+          <w:tcPr>
+            <w:tcW w:type="dxa" w:w="1584"/>
+            <w:tcBorders>
+              <w:top w:val="single" w:color="D9D9D9" w:sz="4"/>
+              <w:bottom w:val="single" w:color="D9D9D9" w:sz="4"/>
+              <w:left w:val="single" w:color="D9D9D9" w:sz="4"/>
+              <w:right w:val="single" w:color="D9D9D9" w:sz="4"/>
+            </w:tcBorders>
+            <w:shd w:fill="E8EEF4"/>
+          </w:tcPr>
+          <w:p>
+            <w:pPr>
+              <w:spacing w:before="100" w:after="100"/>
+            </w:pPr>
+            <w:r>
+              <w:rPr>
+                <w:b/>
+                <w:sz w:val="20"/>
+              </w:rPr>
+              <w:t>Events per s</w:t>
+            </w:r>
+          </w:p>
+        </w:tc>
+        <w:tc>
+          <w:tcPr>
+            <w:tcW w:type="dxa" w:w="2448"/>
+            <w:tcBorders>
+              <w:top w:val="single" w:color="D9D9D9" w:sz="4"/>
+              <w:bottom w:val="single" w:color="D9D9D9" w:sz="4"/>
+              <w:left w:val="single" w:color="D9D9D9" w:sz="4"/>
+              <w:right w:val="single" w:color="D9D9D9" w:sz="4"/>
+            </w:tcBorders>
+            <w:shd w:fill="E8EEF4"/>
+          </w:tcPr>
+          <w:p>
+            <w:pPr>
+              <w:spacing w:before="100" w:after="100"/>
+            </w:pPr>
+            <w:r>
+              <w:rPr>
+                <w:b/>
+                <w:sz w:val="20"/>
+              </w:rPr>
+              <w:t>Policy</w:t>
+            </w:r>
+          </w:p>
+        </w:tc>
+        <w:tc>
+          <w:tcPr>
+            <w:tcW w:type="dxa" w:w="2952"/>
+            <w:tcBorders>
+              <w:top w:val="single" w:color="D9D9D9" w:sz="4"/>
+              <w:bottom w:val="single" w:color="D9D9D9" w:sz="4"/>
+              <w:left w:val="single" w:color="D9D9D9" w:sz="4"/>
+              <w:right w:val="single" w:color="D9D9D9" w:sz="4"/>
+            </w:tcBorders>
+            <w:shd w:fill="E8EEF4"/>
+          </w:tcPr>
+          <w:p>
+            <w:pPr>
+              <w:spacing w:before="100" w:after="100"/>
+            </w:pPr>
+            <w:r>
+              <w:rPr>
+                <w:b/>
+                <w:sz w:val="20"/>
+              </w:rPr>
+              <w:t>High p95 ms</w:t>
+            </w:r>
+          </w:p>
+        </w:tc>
+        <w:tc>
+          <w:tcPr>
+            <w:tcW w:type="dxa" w:w="2952"/>
+            <w:tcBorders>
+              <w:top w:val="single" w:color="D9D9D9" w:sz="4"/>
+              <w:bottom w:val="single" w:color="D9D9D9" w:sz="4"/>
+              <w:left w:val="single" w:color="D9D9D9" w:sz="4"/>
+              <w:right w:val="single" w:color="D9D9D9" w:sz="4"/>
+            </w:tcBorders>
+            <w:shd w:fill="E8EEF4"/>
+          </w:tcPr>
+          <w:p>
+            <w:pPr>
+              <w:spacing w:before="100" w:after="100"/>
+            </w:pPr>
+            <w:r>
+              <w:rPr>
+                <w:b/>
+                <w:sz w:val="20"/>
+              </w:rPr>
+              <w:t>Low p95 ms</w:t>
+            </w:r>
+          </w:p>
+        </w:tc>
+      </w:tr>
+      <w:tr>
+        <w:trPr>
+          <w:cantSplit/>
+        </w:trPr>
+        <w:tc>
+          <w:tcPr>
+            <w:tcW w:type="dxa" w:w="1584"/>
+            <w:tcBorders>
+              <w:top w:val="single" w:color="D9D9D9" w:sz="4"/>
+              <w:bottom w:val="single" w:color="D9D9D9" w:sz="4"/>
+              <w:left w:val="single" w:color="D9D9D9" w:sz="4"/>
+              <w:right w:val="single" w:color="D9D9D9" w:sz="4"/>
+            </w:tcBorders>
+          </w:tcPr>
+          <w:p>
+            <w:pPr>
+              <w:spacing w:before="100" w:after="100"/>
+            </w:pPr>
+            <w:r>
+              <w:rPr>
+                <w:b w:val="0"/>
+                <w:sz w:val="20"/>
+              </w:rPr>
+              <w:t>50</w:t>
+            </w:r>
+          </w:p>
+        </w:tc>
+        <w:tc>
+          <w:tcPr>
+            <w:tcW w:type="dxa" w:w="2448"/>
+            <w:tcBorders>
+              <w:top w:val="single" w:color="D9D9D9" w:sz="4"/>
+              <w:bottom w:val="single" w:color="D9D9D9" w:sz="4"/>
+              <w:left w:val="single" w:color="D9D9D9" w:sz="4"/>
+              <w:right w:val="single" w:color="D9D9D9" w:sz="4"/>
+            </w:tcBorders>
+          </w:tcPr>
+          <w:p>
+            <w:pPr>
+              <w:spacing w:before="100" w:after="100"/>
+            </w:pPr>
+            <w:r>
+              <w:rPr>
+                <w:b w:val="0"/>
+                <w:sz w:val="20"/>
+              </w:rPr>
+              <w:t>fifo</w:t>
+            </w:r>
+          </w:p>
+        </w:tc>
+        <w:tc>
+          <w:tcPr>
+            <w:tcW w:type="dxa" w:w="2952"/>
+            <w:tcBorders>
+              <w:top w:val="single" w:color="D9D9D9" w:sz="4"/>
+              <w:bottom w:val="single" w:color="D9D9D9" w:sz="4"/>
+              <w:left w:val="single" w:color="D9D9D9" w:sz="4"/>
+              <w:right w:val="single" w:color="D9D9D9" w:sz="4"/>
+            </w:tcBorders>
+          </w:tcPr>
+          <w:p>
+            <w:pPr>
+              <w:spacing w:before="100" w:after="100"/>
+            </w:pPr>
+            <w:r>
+              <w:rPr>
+                <w:b w:val="0"/>
+                <w:sz w:val="20"/>
+              </w:rPr>
+              <w:t>29.43</w:t>
+            </w:r>
+          </w:p>
+        </w:tc>
+        <w:tc>
+          <w:tcPr>
+            <w:tcW w:type="dxa" w:w="2952"/>
+            <w:tcBorders>
+              <w:top w:val="single" w:color="D9D9D9" w:sz="4"/>
+              <w:bottom w:val="single" w:color="D9D9D9" w:sz="4"/>
+              <w:left w:val="single" w:color="D9D9D9" w:sz="4"/>
+              <w:right w:val="single" w:color="D9D9D9" w:sz="4"/>
+            </w:tcBorders>
+          </w:tcPr>
+          <w:p>
+            <w:pPr>
+              <w:spacing w:before="100" w:after="100"/>
+            </w:pPr>
+            <w:r>
+              <w:rPr>
+                <w:b w:val="0"/>
+                <w:sz w:val="20"/>
+              </w:rPr>
+              <w:t>30.53</w:t>
+            </w:r>
+          </w:p>
+        </w:tc>
+      </w:tr>
+      <w:tr>
+        <w:trPr>
+          <w:cantSplit/>
+        </w:trPr>
+        <w:tc>
+          <w:tcPr>
+            <w:tcW w:type="dxa" w:w="1584"/>
+            <w:tcBorders>
+              <w:top w:val="single" w:color="D9D9D9" w:sz="4"/>
+              <w:bottom w:val="single" w:color="D9D9D9" w:sz="4"/>
+              <w:left w:val="single" w:color="D9D9D9" w:sz="4"/>
+              <w:right w:val="single" w:color="D9D9D9" w:sz="4"/>
+            </w:tcBorders>
+          </w:tcPr>
+          <w:p>
+            <w:pPr>
+              <w:spacing w:before="100" w:after="100"/>
+            </w:pPr>
+            <w:r>
+              <w:rPr>
+                <w:b w:val="0"/>
+                <w:sz w:val="20"/>
+              </w:rPr>
+              <w:t>50</w:t>
+            </w:r>
+          </w:p>
+        </w:tc>
+        <w:tc>
+          <w:tcPr>
+            <w:tcW w:type="dxa" w:w="2448"/>
+            <w:tcBorders>
+              <w:top w:val="single" w:color="D9D9D9" w:sz="4"/>
+              <w:bottom w:val="single" w:color="D9D9D9" w:sz="4"/>
+              <w:left w:val="single" w:color="D9D9D9" w:sz="4"/>
+              <w:right w:val="single" w:color="D9D9D9" w:sz="4"/>
+            </w:tcBorders>
+          </w:tcPr>
+          <w:p>
+            <w:pPr>
+              <w:spacing w:before="100" w:after="100"/>
+            </w:pPr>
+            <w:r>
+              <w:rPr>
+                <w:b w:val="0"/>
+                <w:sz w:val="20"/>
+              </w:rPr>
+              <w:t>priority</w:t>
+            </w:r>
+          </w:p>
+        </w:tc>
+        <w:tc>
+          <w:tcPr>
+            <w:tcW w:type="dxa" w:w="2952"/>
+            <w:tcBorders>
+              <w:top w:val="single" w:color="D9D9D9" w:sz="4"/>
+              <w:bottom w:val="single" w:color="D9D9D9" w:sz="4"/>
+              <w:left w:val="single" w:color="D9D9D9" w:sz="4"/>
+              <w:right w:val="single" w:color="D9D9D9" w:sz="4"/>
+            </w:tcBorders>
+          </w:tcPr>
+          <w:p>
+            <w:pPr>
+              <w:spacing w:before="100" w:after="100"/>
+            </w:pPr>
+            <w:r>
+              <w:rPr>
+                <w:b w:val="0"/>
+                <w:sz w:val="20"/>
+              </w:rPr>
+              <w:t>19.35</w:t>
+            </w:r>
+          </w:p>
+        </w:tc>
+        <w:tc>
+          <w:tcPr>
+            <w:tcW w:type="dxa" w:w="2952"/>
+            <w:tcBorders>
+              <w:top w:val="single" w:color="D9D9D9" w:sz="4"/>
+              <w:bottom w:val="single" w:color="D9D9D9" w:sz="4"/>
+              <w:left w:val="single" w:color="D9D9D9" w:sz="4"/>
+              <w:right w:val="single" w:color="D9D9D9" w:sz="4"/>
+            </w:tcBorders>
+          </w:tcPr>
+          <w:p>
+            <w:pPr>
+              <w:spacing w:before="100" w:after="100"/>
+            </w:pPr>
+            <w:r>
+              <w:rPr>
+                <w:b w:val="0"/>
+                <w:sz w:val="20"/>
+              </w:rPr>
+              <w:t>35.51</w:t>
+            </w:r>
+          </w:p>
+        </w:tc>
+      </w:tr>
+      <w:tr>
+        <w:trPr>
+          <w:cantSplit/>
+        </w:trPr>
+        <w:tc>
+          <w:tcPr>
+            <w:tcW w:type="dxa" w:w="1584"/>
+            <w:tcBorders>
+              <w:top w:val="single" w:color="D9D9D9" w:sz="4"/>
+              <w:bottom w:val="single" w:color="D9D9D9" w:sz="4"/>
+              <w:left w:val="single" w:color="D9D9D9" w:sz="4"/>
+              <w:right w:val="single" w:color="D9D9D9" w:sz="4"/>
+            </w:tcBorders>
+          </w:tcPr>
+          <w:p>
+            <w:pPr>
+              <w:spacing w:before="100" w:after="100"/>
+            </w:pPr>
+            <w:r>
+              <w:rPr>
+                <w:b w:val="0"/>
+                <w:sz w:val="20"/>
+              </w:rPr>
+              <w:t>50</w:t>
+            </w:r>
+          </w:p>
+        </w:tc>
+        <w:tc>
+          <w:tcPr>
+            <w:tcW w:type="dxa" w:w="2448"/>
+            <w:tcBorders>
+              <w:top w:val="single" w:color="D9D9D9" w:sz="4"/>
+              <w:bottom w:val="single" w:color="D9D9D9" w:sz="4"/>
+              <w:left w:val="single" w:color="D9D9D9" w:sz="4"/>
+              <w:right w:val="single" w:color="D9D9D9" w:sz="4"/>
+            </w:tcBorders>
+          </w:tcPr>
+          <w:p>
+            <w:pPr>
+              <w:spacing w:before="100" w:after="100"/>
+            </w:pPr>
+            <w:r>
+              <w:rPr>
+                <w:b w:val="0"/>
+                <w:sz w:val="20"/>
+              </w:rPr>
+              <w:t>aging</w:t>
+            </w:r>
+          </w:p>
+        </w:tc>
+        <w:tc>
+          <w:tcPr>
+            <w:tcW w:type="dxa" w:w="2952"/>
+            <w:tcBorders>
+              <w:top w:val="single" w:color="D9D9D9" w:sz="4"/>
+              <w:bottom w:val="single" w:color="D9D9D9" w:sz="4"/>
+              <w:left w:val="single" w:color="D9D9D9" w:sz="4"/>
+              <w:right w:val="single" w:color="D9D9D9" w:sz="4"/>
+            </w:tcBorders>
+          </w:tcPr>
+          <w:p>
+            <w:pPr>
+              <w:spacing w:before="100" w:after="100"/>
+            </w:pPr>
+            <w:r>
+              <w:rPr>
+                <w:b w:val="0"/>
+                <w:sz w:val="20"/>
+              </w:rPr>
+              <w:t>19.35</w:t>
+            </w:r>
+          </w:p>
+        </w:tc>
+        <w:tc>
+          <w:tcPr>
+            <w:tcW w:type="dxa" w:w="2952"/>
+            <w:tcBorders>
+              <w:top w:val="single" w:color="D9D9D9" w:sz="4"/>
+              <w:bottom w:val="single" w:color="D9D9D9" w:sz="4"/>
+              <w:left w:val="single" w:color="D9D9D9" w:sz="4"/>
+              <w:right w:val="single" w:color="D9D9D9" w:sz="4"/>
+            </w:tcBorders>
+          </w:tcPr>
+          <w:p>
+            <w:pPr>
+              <w:spacing w:before="100" w:after="100"/>
+            </w:pPr>
+            <w:r>
+              <w:rPr>
+                <w:b w:val="0"/>
+                <w:sz w:val="20"/>
+              </w:rPr>
+              <w:t>35.51</w:t>
+            </w:r>
+          </w:p>
+        </w:tc>
+      </w:tr>
+      <w:tr>
+        <w:trPr>
+          <w:cantSplit/>
+        </w:trPr>
+        <w:tc>
+          <w:tcPr>
+            <w:tcW w:type="dxa" w:w="1584"/>
+            <w:tcBorders>
+              <w:top w:val="single" w:color="D9D9D9" w:sz="4"/>
+              <w:bottom w:val="single" w:color="D9D9D9" w:sz="4"/>
+              <w:left w:val="single" w:color="D9D9D9" w:sz="4"/>
+              <w:right w:val="single" w:color="D9D9D9" w:sz="4"/>
+            </w:tcBorders>
+          </w:tcPr>
+          <w:p>
+            <w:pPr>
+              <w:spacing w:before="100" w:after="100"/>
+            </w:pPr>
+            <w:r>
+              <w:rPr>
+                <w:b w:val="0"/>
+                <w:sz w:val="20"/>
+              </w:rPr>
+              <w:t>90</w:t>
+            </w:r>
+          </w:p>
+        </w:tc>
+        <w:tc>
+          <w:tcPr>
+            <w:tcW w:type="dxa" w:w="2448"/>
+            <w:tcBorders>
+              <w:top w:val="single" w:color="D9D9D9" w:sz="4"/>
+              <w:bottom w:val="single" w:color="D9D9D9" w:sz="4"/>
+              <w:left w:val="single" w:color="D9D9D9" w:sz="4"/>
+              <w:right w:val="single" w:color="D9D9D9" w:sz="4"/>
+            </w:tcBorders>
+          </w:tcPr>
+          <w:p>
+            <w:pPr>
+              <w:spacing w:before="100" w:after="100"/>
+            </w:pPr>
+            <w:r>
+              <w:rPr>
+                <w:b w:val="0"/>
+                <w:sz w:val="20"/>
+              </w:rPr>
+              <w:t>fifo</w:t>
+            </w:r>
+          </w:p>
+        </w:tc>
+        <w:tc>
+          <w:tcPr>
+            <w:tcW w:type="dxa" w:w="2952"/>
+            <w:tcBorders>
+              <w:top w:val="single" w:color="D9D9D9" w:sz="4"/>
+              <w:bottom w:val="single" w:color="D9D9D9" w:sz="4"/>
+              <w:left w:val="single" w:color="D9D9D9" w:sz="4"/>
+              <w:right w:val="single" w:color="D9D9D9" w:sz="4"/>
+            </w:tcBorders>
+          </w:tcPr>
+          <w:p>
+            <w:pPr>
+              <w:spacing w:before="100" w:after="100"/>
+            </w:pPr>
+            <w:r>
+              <w:rPr>
+                <w:b w:val="0"/>
+                <w:sz w:val="20"/>
+              </w:rPr>
+              <w:t>116.41</w:t>
+            </w:r>
+          </w:p>
+        </w:tc>
+        <w:tc>
+          <w:tcPr>
+            <w:tcW w:type="dxa" w:w="2952"/>
+            <w:tcBorders>
+              <w:top w:val="single" w:color="D9D9D9" w:sz="4"/>
+              <w:bottom w:val="single" w:color="D9D9D9" w:sz="4"/>
+              <w:left w:val="single" w:color="D9D9D9" w:sz="4"/>
+              <w:right w:val="single" w:color="D9D9D9" w:sz="4"/>
+            </w:tcBorders>
+          </w:tcPr>
+          <w:p>
+            <w:pPr>
+              <w:spacing w:before="100" w:after="100"/>
+            </w:pPr>
+            <w:r>
+              <w:rPr>
+                <w:b w:val="0"/>
+                <w:sz w:val="20"/>
+              </w:rPr>
+              <w:t>118.68</w:t>
+            </w:r>
+          </w:p>
+        </w:tc>
+      </w:tr>
+      <w:tr>
+        <w:trPr>
+          <w:cantSplit/>
+        </w:trPr>
+        <w:tc>
+          <w:tcPr>
+            <w:tcW w:type="dxa" w:w="1584"/>
+            <w:tcBorders>
+              <w:top w:val="single" w:color="D9D9D9" w:sz="4"/>
+              <w:bottom w:val="single" w:color="D9D9D9" w:sz="4"/>
+              <w:left w:val="single" w:color="D9D9D9" w:sz="4"/>
+              <w:right w:val="single" w:color="D9D9D9" w:sz="4"/>
+            </w:tcBorders>
+          </w:tcPr>
+          <w:p>
+            <w:pPr>
+              <w:spacing w:before="100" w:after="100"/>
+            </w:pPr>
+            <w:r>
+              <w:rPr>
+                <w:b w:val="0"/>
+                <w:sz w:val="20"/>
+              </w:rPr>
+              <w:t>90</w:t>
+            </w:r>
+          </w:p>
+        </w:tc>
+        <w:tc>
+          <w:tcPr>
+            <w:tcW w:type="dxa" w:w="2448"/>
+            <w:tcBorders>
+              <w:top w:val="single" w:color="D9D9D9" w:sz="4"/>
+              <w:bottom w:val="single" w:color="D9D9D9" w:sz="4"/>
+              <w:left w:val="single" w:color="D9D9D9" w:sz="4"/>
+              <w:right w:val="single" w:color="D9D9D9" w:sz="4"/>
+            </w:tcBorders>
+          </w:tcPr>
+          <w:p>
+            <w:pPr>
+              <w:spacing w:before="100" w:after="100"/>
+            </w:pPr>
+            <w:r>
+              <w:rPr>
+                <w:b w:val="0"/>
+                <w:sz w:val="20"/>
+              </w:rPr>
+              <w:t>priority</w:t>
+            </w:r>
+          </w:p>
+        </w:tc>
+        <w:tc>
+          <w:tcPr>
+            <w:tcW w:type="dxa" w:w="2952"/>
+            <w:tcBorders>
+              <w:top w:val="single" w:color="D9D9D9" w:sz="4"/>
+              <w:bottom w:val="single" w:color="D9D9D9" w:sz="4"/>
+              <w:left w:val="single" w:color="D9D9D9" w:sz="4"/>
+              <w:right w:val="single" w:color="D9D9D9" w:sz="4"/>
+            </w:tcBorders>
+          </w:tcPr>
+          <w:p>
+            <w:pPr>
+              <w:spacing w:before="100" w:after="100"/>
+            </w:pPr>
+            <w:r>
+              <w:rPr>
+                <w:b w:val="0"/>
+                <w:sz w:val="20"/>
+              </w:rPr>
+              <w:t>21.11</w:t>
+            </w:r>
+          </w:p>
+        </w:tc>
+        <w:tc>
+          <w:tcPr>
+            <w:tcW w:type="dxa" w:w="2952"/>
+            <w:tcBorders>
+              <w:top w:val="single" w:color="D9D9D9" w:sz="4"/>
+              <w:bottom w:val="single" w:color="D9D9D9" w:sz="4"/>
+              <w:left w:val="single" w:color="D9D9D9" w:sz="4"/>
+              <w:right w:val="single" w:color="D9D9D9" w:sz="4"/>
+            </w:tcBorders>
+          </w:tcPr>
+          <w:p>
+            <w:pPr>
+              <w:spacing w:before="100" w:after="100"/>
+            </w:pPr>
+            <w:r>
+              <w:rPr>
+                <w:b w:val="0"/>
+                <w:sz w:val="20"/>
+              </w:rPr>
+              <w:t>160.49</w:t>
+            </w:r>
+          </w:p>
+        </w:tc>
+      </w:tr>
+      <w:tr>
+        <w:trPr>
+          <w:cantSplit/>
+        </w:trPr>
+        <w:tc>
+          <w:tcPr>
+            <w:tcW w:type="dxa" w:w="1584"/>
+            <w:tcBorders>
+              <w:top w:val="single" w:color="D9D9D9" w:sz="4"/>
+              <w:bottom w:val="single" w:color="D9D9D9" w:sz="4"/>
+              <w:left w:val="single" w:color="D9D9D9" w:sz="4"/>
+              <w:right w:val="single" w:color="D9D9D9" w:sz="4"/>
+            </w:tcBorders>
+          </w:tcPr>
+          <w:p>
+            <w:pPr>
+              <w:spacing w:before="100" w:after="100"/>
+            </w:pPr>
+            <w:r>
+              <w:rPr>
+                <w:b w:val="0"/>
+                <w:sz w:val="20"/>
+              </w:rPr>
+              <w:t>90</w:t>
+            </w:r>
+          </w:p>
+        </w:tc>
+        <w:tc>
+          <w:tcPr>
+            <w:tcW w:type="dxa" w:w="2448"/>
+            <w:tcBorders>
+              <w:top w:val="single" w:color="D9D9D9" w:sz="4"/>
+              <w:bottom w:val="single" w:color="D9D9D9" w:sz="4"/>
+              <w:left w:val="single" w:color="D9D9D9" w:sz="4"/>
+              <w:right w:val="single" w:color="D9D9D9" w:sz="4"/>
+            </w:tcBorders>
+          </w:tcPr>
+          <w:p>
+            <w:pPr>
+              <w:spacing w:before="100" w:after="100"/>
+            </w:pPr>
+            <w:r>
+              <w:rPr>
+                <w:b w:val="0"/>
+                <w:sz w:val="20"/>
+              </w:rPr>
+              <w:t>aging</w:t>
+            </w:r>
+          </w:p>
+        </w:tc>
+        <w:tc>
+          <w:tcPr>
+            <w:tcW w:type="dxa" w:w="2952"/>
+            <w:tcBorders>
+              <w:top w:val="single" w:color="D9D9D9" w:sz="4"/>
+              <w:bottom w:val="single" w:color="D9D9D9" w:sz="4"/>
+              <w:left w:val="single" w:color="D9D9D9" w:sz="4"/>
+              <w:right w:val="single" w:color="D9D9D9" w:sz="4"/>
+            </w:tcBorders>
+          </w:tcPr>
+          <w:p>
+            <w:pPr>
+              <w:spacing w:before="100" w:after="100"/>
+            </w:pPr>
+            <w:r>
+              <w:rPr>
+                <w:b w:val="0"/>
+                <w:sz w:val="20"/>
+              </w:rPr>
+              <w:t>28.61</w:t>
+            </w:r>
+          </w:p>
+        </w:tc>
+        <w:tc>
+          <w:tcPr>
+            <w:tcW w:type="dxa" w:w="2952"/>
+            <w:tcBorders>
+              <w:top w:val="single" w:color="D9D9D9" w:sz="4"/>
+              <w:bottom w:val="single" w:color="D9D9D9" w:sz="4"/>
+              <w:left w:val="single" w:color="D9D9D9" w:sz="4"/>
+              <w:right w:val="single" w:color="D9D9D9" w:sz="4"/>
+            </w:tcBorders>
+          </w:tcPr>
+          <w:p>
+            <w:pPr>
+              <w:spacing w:before="100" w:after="100"/>
+            </w:pPr>
+            <w:r>
+              <w:rPr>
+                <w:b w:val="0"/>
+                <w:sz w:val="20"/>
+              </w:rPr>
+              <w:t>140.37</w:t>
+            </w:r>
+          </w:p>
+        </w:tc>
+      </w:tr>
+      <w:tr>
+        <w:trPr>
+          <w:cantSplit/>
+        </w:trPr>
+        <w:tc>
+          <w:tcPr>
+            <w:tcW w:type="dxa" w:w="1584"/>
+            <w:tcBorders>
+              <w:top w:val="single" w:color="D9D9D9" w:sz="4"/>
+              <w:bottom w:val="single" w:color="D9D9D9" w:sz="4"/>
+              <w:left w:val="single" w:color="D9D9D9" w:sz="4"/>
+              <w:right w:val="single" w:color="D9D9D9" w:sz="4"/>
+            </w:tcBorders>
+          </w:tcPr>
+          <w:p>
+            <w:pPr>
+              <w:spacing w:before="100" w:after="100"/>
+            </w:pPr>
+            <w:r>
+              <w:rPr>
+                <w:b w:val="0"/>
+                <w:sz w:val="20"/>
+              </w:rPr>
+              <w:t>120</w:t>
+            </w:r>
+          </w:p>
+        </w:tc>
+        <w:tc>
+          <w:tcPr>
+            <w:tcW w:type="dxa" w:w="2448"/>
+            <w:tcBorders>
+              <w:top w:val="single" w:color="D9D9D9" w:sz="4"/>
+              <w:bottom w:val="single" w:color="D9D9D9" w:sz="4"/>
+              <w:left w:val="single" w:color="D9D9D9" w:sz="4"/>
+              <w:right w:val="single" w:color="D9D9D9" w:sz="4"/>
+            </w:tcBorders>
+          </w:tcPr>
+          <w:p>
+            <w:pPr>
+              <w:spacing w:before="100" w:after="100"/>
+            </w:pPr>
+            <w:r>
+              <w:rPr>
+                <w:b w:val="0"/>
+                <w:sz w:val="20"/>
+              </w:rPr>
+              <w:t>fifo</w:t>
+            </w:r>
+          </w:p>
+        </w:tc>
+        <w:tc>
+          <w:tcPr>
+            <w:tcW w:type="dxa" w:w="2952"/>
+            <w:tcBorders>
+              <w:top w:val="single" w:color="D9D9D9" w:sz="4"/>
+              <w:bottom w:val="single" w:color="D9D9D9" w:sz="4"/>
+              <w:left w:val="single" w:color="D9D9D9" w:sz="4"/>
+              <w:right w:val="single" w:color="D9D9D9" w:sz="4"/>
+            </w:tcBorders>
+          </w:tcPr>
+          <w:p>
+            <w:pPr>
+              <w:spacing w:before="100" w:after="100"/>
+            </w:pPr>
+            <w:r>
+              <w:rPr>
+                <w:b w:val="0"/>
+                <w:sz w:val="20"/>
+              </w:rPr>
+              <w:t>1568.02</w:t>
+            </w:r>
+          </w:p>
+        </w:tc>
+        <w:tc>
+          <w:tcPr>
+            <w:tcW w:type="dxa" w:w="2952"/>
+            <w:tcBorders>
+              <w:top w:val="single" w:color="D9D9D9" w:sz="4"/>
+              <w:bottom w:val="single" w:color="D9D9D9" w:sz="4"/>
+              <w:left w:val="single" w:color="D9D9D9" w:sz="4"/>
+              <w:right w:val="single" w:color="D9D9D9" w:sz="4"/>
+            </w:tcBorders>
+          </w:tcPr>
+          <w:p>
+            <w:pPr>
+              <w:spacing w:before="100" w:after="100"/>
+            </w:pPr>
+            <w:r>
+              <w:rPr>
+                <w:b w:val="0"/>
+                <w:sz w:val="20"/>
+              </w:rPr>
+              <w:t>1604.50</w:t>
+            </w:r>
+          </w:p>
+        </w:tc>
+      </w:tr>
+      <w:tr>
+        <w:trPr>
+          <w:cantSplit/>
+        </w:trPr>
+        <w:tc>
+          <w:tcPr>
+            <w:tcW w:type="dxa" w:w="1584"/>
+            <w:tcBorders>
+              <w:top w:val="single" w:color="D9D9D9" w:sz="4"/>
+              <w:bottom w:val="single" w:color="D9D9D9" w:sz="4"/>
+              <w:left w:val="single" w:color="D9D9D9" w:sz="4"/>
+              <w:right w:val="single" w:color="D9D9D9" w:sz="4"/>
+            </w:tcBorders>
+          </w:tcPr>
+          <w:p>
+            <w:pPr>
+              <w:spacing w:before="100" w:after="100"/>
+            </w:pPr>
+            <w:r>
+              <w:rPr>
+                <w:b w:val="0"/>
+                <w:sz w:val="20"/>
+              </w:rPr>
+              <w:t>120</w:t>
+            </w:r>
+          </w:p>
+        </w:tc>
+        <w:tc>
+          <w:tcPr>
+            <w:tcW w:type="dxa" w:w="2448"/>
+            <w:tcBorders>
+              <w:top w:val="single" w:color="D9D9D9" w:sz="4"/>
+              <w:bottom w:val="single" w:color="D9D9D9" w:sz="4"/>
+              <w:left w:val="single" w:color="D9D9D9" w:sz="4"/>
+              <w:right w:val="single" w:color="D9D9D9" w:sz="4"/>
+            </w:tcBorders>
+          </w:tcPr>
+          <w:p>
+            <w:pPr>
+              <w:spacing w:before="100" w:after="100"/>
+            </w:pPr>
+            <w:r>
+              <w:rPr>
+                <w:b w:val="0"/>
+                <w:sz w:val="20"/>
+              </w:rPr>
+              <w:t>priority</w:t>
+            </w:r>
+          </w:p>
+        </w:tc>
+        <w:tc>
+          <w:tcPr>
+            <w:tcW w:type="dxa" w:w="2952"/>
+            <w:tcBorders>
+              <w:top w:val="single" w:color="D9D9D9" w:sz="4"/>
+              <w:bottom w:val="single" w:color="D9D9D9" w:sz="4"/>
+              <w:left w:val="single" w:color="D9D9D9" w:sz="4"/>
+              <w:right w:val="single" w:color="D9D9D9" w:sz="4"/>
+            </w:tcBorders>
+          </w:tcPr>
+          <w:p>
+            <w:pPr>
+              <w:spacing w:before="100" w:after="100"/>
+            </w:pPr>
+            <w:r>
+              <w:rPr>
+                <w:b w:val="0"/>
+                <w:sz w:val="20"/>
+              </w:rPr>
+              <w:t>22.67</w:t>
+            </w:r>
+          </w:p>
+        </w:tc>
+        <w:tc>
+          <w:tcPr>
+            <w:tcW w:type="dxa" w:w="2952"/>
+            <w:tcBorders>
+              <w:top w:val="single" w:color="D9D9D9" w:sz="4"/>
+              <w:bottom w:val="single" w:color="D9D9D9" w:sz="4"/>
+              <w:left w:val="single" w:color="D9D9D9" w:sz="4"/>
+              <w:right w:val="single" w:color="D9D9D9" w:sz="4"/>
+            </w:tcBorders>
+          </w:tcPr>
+          <w:p>
+            <w:pPr>
+              <w:spacing w:before="100" w:after="100"/>
+            </w:pPr>
+            <w:r>
+              <w:rPr>
+                <w:b w:val="0"/>
+                <w:sz w:val="20"/>
+              </w:rPr>
+              <w:t>1921.62</w:t>
+            </w:r>
+          </w:p>
+        </w:tc>
+      </w:tr>
+      <w:tr>
+        <w:trPr>
+          <w:cantSplit/>
+        </w:trPr>
+        <w:tc>
+          <w:tcPr>
+            <w:tcW w:type="dxa" w:w="1584"/>
+            <w:tcBorders>
+              <w:top w:val="single" w:color="D9D9D9" w:sz="4"/>
+              <w:bottom w:val="single" w:color="D9D9D9" w:sz="4"/>
+              <w:left w:val="single" w:color="D9D9D9" w:sz="4"/>
+              <w:right w:val="single" w:color="D9D9D9" w:sz="4"/>
+            </w:tcBorders>
+          </w:tcPr>
+          <w:p>
+            <w:pPr>
+              <w:spacing w:before="100" w:after="100"/>
+            </w:pPr>
+            <w:r>
+              <w:rPr>
+                <w:b w:val="0"/>
+                <w:sz w:val="20"/>
+              </w:rPr>
+              <w:t>120</w:t>
+            </w:r>
+          </w:p>
+        </w:tc>
+        <w:tc>
+          <w:tcPr>
+            <w:tcW w:type="dxa" w:w="2448"/>
+            <w:tcBorders>
+              <w:top w:val="single" w:color="D9D9D9" w:sz="4"/>
+              <w:bottom w:val="single" w:color="D9D9D9" w:sz="4"/>
+              <w:left w:val="single" w:color="D9D9D9" w:sz="4"/>
+              <w:right w:val="single" w:color="D9D9D9" w:sz="4"/>
+            </w:tcBorders>
+          </w:tcPr>
+          <w:p>
+            <w:pPr>
+              <w:spacing w:before="100" w:after="100"/>
+            </w:pPr>
+            <w:r>
+              <w:rPr>
+                <w:b w:val="0"/>
+                <w:sz w:val="20"/>
+              </w:rPr>
+              <w:t>aging</w:t>
+            </w:r>
+          </w:p>
+        </w:tc>
+        <w:tc>
+          <w:tcPr>
+            <w:tcW w:type="dxa" w:w="2952"/>
+            <w:tcBorders>
+              <w:top w:val="single" w:color="D9D9D9" w:sz="4"/>
+              <w:bottom w:val="single" w:color="D9D9D9" w:sz="4"/>
+              <w:left w:val="single" w:color="D9D9D9" w:sz="4"/>
+              <w:right w:val="single" w:color="D9D9D9" w:sz="4"/>
+            </w:tcBorders>
+          </w:tcPr>
+          <w:p>
+            <w:pPr>
+              <w:spacing w:before="100" w:after="100"/>
+            </w:pPr>
+            <w:r>
+              <w:rPr>
+                <w:b w:val="0"/>
+                <w:sz w:val="20"/>
+              </w:rPr>
+              <w:t>1568.02</w:t>
+            </w:r>
+          </w:p>
+        </w:tc>
+        <w:tc>
+          <w:tcPr>
+            <w:tcW w:type="dxa" w:w="2952"/>
+            <w:tcBorders>
+              <w:top w:val="single" w:color="D9D9D9" w:sz="4"/>
+              <w:bottom w:val="single" w:color="D9D9D9" w:sz="4"/>
+              <w:left w:val="single" w:color="D9D9D9" w:sz="4"/>
+              <w:right w:val="single" w:color="D9D9D9" w:sz="4"/>
+            </w:tcBorders>
+          </w:tcPr>
+          <w:p>
+            <w:pPr>
+              <w:spacing w:before="100" w:after="100"/>
+            </w:pPr>
+            <w:r>
+              <w:rPr>
+                <w:b w:val="0"/>
+                <w:sz w:val="20"/>
+              </w:rPr>
+              <w:t>1604.50</w:t>
+            </w:r>
+          </w:p>
+        </w:tc>
+      </w:tr>
+    </w:tbl>
+    <w:p>
+      <w:pPr>
+        <w:spacing w:after="40"/>
+      </w:pPr>
+    </w:p>
+    <w:p>
+      <w:r>
+        <w:t>Table values are means of ten run-level p95 estimates, not pooled percentiles. At 90 events/s, aging minus strict priority changes high p95 by +7.50 ms and low p95 by -20.13 ms. Exploratory paired bootstrap 95 percent intervals are [0.22, 20.94] ms and [-28.23, -11.78] ms respectively, based on 10000 resamples of ten seed pairs.</w:t>
+      </w:r>
+    </w:p>
+    <w:p>
+      <w:r>
+        <w:t>At 120 events/s, aging loses much of the urgent-latency benefit. This result motivates testing safeguards; it does not show that the proposed adaptive rule will work. The overload case is finite, not steady state. Deadlines are illustrative. With about 100 high-class samples per run, p99 estimates are unstable. Real workloads, bounded queues and live MQTT remain unvalidated.</w:t>
+      </w:r>
+    </w:p>
+    <w:p>
+      <w:r>
+        <w:t>Evidence and reproduction instructions are in evidence/pilot/. The bundle includes every run/class metric, configuration, source hashes, paired intervals and one complete compressed raw run. The runner regenerates all 90 per-event CSV files locally. No experimental result from this pilot establishes novelty.</w:t>
+      </w:r>
+    </w:p>
+    <w:p>
+      <w:pPr>
+        <w:pStyle w:val="Heading1"/>
+        <w:pageBreakBefore/>
+      </w:pPr>
+      <w:r>
+        <w:t>References for priority and delivery</w:t>
+      </w:r>
+    </w:p>
+    <w:p>
+      <w:pPr>
+        <w:pStyle w:val="Heading2"/>
+      </w:pPr>
+      <w:r>
+        <w:t>R1</w:t>
+      </w:r>
+    </w:p>
+    <w:p>
+      <w:r>
+        <w:t>Gaetano Patti; Luca Leonardi; Giuseppe Testa; Lucia Lo Bello. 2024. PrioMQTT: A prioritized version of the MQTT protocol. Computer Communications, 220, 43–51. Publisher: Elsevier. DOI: 10.1016/j.comcom.2024.03.018. https://doi.org/10.1016/j.comcom.2024.03.018</w:t>
+      </w:r>
+    </w:p>
+    <w:p>
+      <w:r>
+        <w:t>Relevance: Prioritizes time-critical traffic using a UDP-based MQTT extension.</w:t>
+      </w:r>
+    </w:p>
+    <w:p>
+      <w:pPr>
+        <w:pStyle w:val="Heading2"/>
+      </w:pPr>
+      <w:r>
+        <w:t>R2</w:t>
+      </w:r>
+    </w:p>
+    <w:p>
+      <w:r>
+        <w:t>P S Akshatha; S Divyashree; S M Dilip Kumar. 2024. Priority-enabled MQTT: a robust approach to emergency event messaging. Journal of Engineering and Applied Science, 71, article 67. Publisher: Springer Nature. DOI: 10.1186/s44147-024-00400-2. https://doi.org/10.1186/s44147-024-00400-2</w:t>
+      </w:r>
+    </w:p>
+    <w:p>
+      <w:r>
+        <w:t>Relevance: RabbitMQ virtual queues distinguish urgent, critical and FCFS messages.</w:t>
+      </w:r>
+    </w:p>
+    <w:p>
+      <w:pPr>
+        <w:pStyle w:val="Heading2"/>
+      </w:pPr>
+      <w:r>
+        <w:t>R3</w:t>
+      </w:r>
+    </w:p>
+    <w:p>
+      <w:r>
+        <w:t>Jiby J. Puthiyidam; Shelbi Joseph. 2024. PR-MQTT: a novel approach for traffic reduction and message prioritisation in IoT applications. International Journal of Web Engineering and Technology, 19(1), 44–66. Publisher: Inderscience. DOI: 10.1504/IJWET.2024.138096. https://doi.org/10.1504/IJWET.2024.138096</w:t>
+      </w:r>
+    </w:p>
+    <w:p>
+      <w:r>
+        <w:t>Relevance: Combines selective transmission and urgent-message processing in HBMQTT.</w:t>
+      </w:r>
+    </w:p>
+    <w:p>
+      <w:pPr>
+        <w:pStyle w:val="Heading2"/>
+      </w:pPr>
+      <w:r>
+        <w:t>R4</w:t>
+      </w:r>
+    </w:p>
+    <w:p>
+      <w:r>
+        <w:t>Giuseppe Testa; Luca Leonardi; Lucia Lo Bello; Gaetano Patti. 2024. Towards Integrating MQTT with Time-Sensitive Networking. 2024 IEEE 29th International Conference on Emerging Technologies and Factory Automation (ETFA). Publisher: IEEE. DOI: 10.1109/ETFA61755.2024.10710933. https://doi.org/10.1109/ETFA61755.2024.10710933</w:t>
+      </w:r>
+    </w:p>
+    <w:p>
+      <w:r>
+        <w:t>Relevance: Explores integrating PrioMQTT with TSN for traffic with diverse timing needs.</w:t>
+      </w:r>
+    </w:p>
+    <w:p>
+      <w:r>
+        <w:t>Complete verification links and access limitations are maintained in docs/related-work.md. Journal quartiles and indexing were not assessed. The candidate policy will be finalized only after full-text comparison with the closest studies.</w:t>
+      </w:r>
+    </w:p>
+    <w:p>
+      <w:pPr>
+        <w:pStyle w:val="Heading1"/>
+        <w:pageBreakBefore/>
+      </w:pPr>
+      <w:r>
+        <w:t>References for timing and fairness</w:t>
+      </w:r>
+    </w:p>
+    <w:p>
+      <w:pPr>
+        <w:pStyle w:val="Heading2"/>
+      </w:pPr>
+      <w:r>
+        <w:t>R5</w:t>
+      </w:r>
+    </w:p>
+    <w:p>
+      <w:r>
+        <w:t>Ehsan Shahri; Paulo Pedreiras; Luis Almeida. 2022. Extending MQTT with Real-Time Communication Services Based on SDN. Sensors, 22(9), article 3162. Publisher: MDPI. DOI: 10.3390/s22093162. https://doi.org/10.3390/s22093162</w:t>
+      </w:r>
+    </w:p>
+    <w:p>
+      <w:r>
+        <w:t>Relevance: Maps application timing requirements to SDN resource reservations.</w:t>
+      </w:r>
+    </w:p>
+    <w:p>
+      <w:pPr>
+        <w:pStyle w:val="Heading2"/>
+      </w:pPr>
+      <w:r>
+        <w:t>R6</w:t>
+      </w:r>
+    </w:p>
+    <w:p>
+      <w:r>
+        <w:t>Ehsan Shahri; Paulo Pedreiras; Luis Almeida. 2023. Response Time Analysis for RT-MQTT Protocol Grounded on SDN. Fourth Workshop on Next Generation Real-Time Embedded Systems (NG-RES 2023), OASIcs 108, 5:1–5:15. Publisher: Schloss Dagstuhl – Leibniz-Zentrum für Informatik. DOI: 10.4230/OASIcs.NG-RES.2023.5. https://doi.org/10.4230/OASIcs.NG-RES.2023.5</w:t>
+      </w:r>
+    </w:p>
+    <w:p>
+      <w:r>
+        <w:t>Relevance: Derives worst-case response-time analysis for an SDN-based MQTT architecture.</w:t>
+      </w:r>
+    </w:p>
+    <w:p>
+      <w:pPr>
+        <w:pStyle w:val="Heading2"/>
+      </w:pPr>
+      <w:r>
+        <w:t>R7</w:t>
+      </w:r>
+    </w:p>
+    <w:p>
+      <w:r>
+        <w:t>Kitae Hwang; Jae Moon Lee; In Hwan Jung; Dong-Hee Lee. 2019. Modification of Mosquitto Broker for Delivery of Urgent MQTT Message. 2019 IEEE Eurasia Conference on IOT, Communication and Engineering (ECICE), 166–167. Publisher: IEEE. DOI: 10.1109/ECICE47484.2019.8942800. https://doi.org/10.1109/ECICE47484.2019.8942800</w:t>
+      </w:r>
+    </w:p>
+    <w:p>
+      <w:r>
+        <w:t>Relevance: Modifies Mosquitto for urgent message delivery.</w:t>
+      </w:r>
+    </w:p>
+    <w:p>
+      <w:pPr>
+        <w:pStyle w:val="Heading2"/>
+      </w:pPr>
+      <w:r>
+        <w:t>R8</w:t>
+      </w:r>
+    </w:p>
+    <w:p>
+      <w:r>
+        <w:t>João Carlos N. Bittencourt; Paulo Portugal; Francisco Vasques; Daniel G. Costa. 2026. Multi-Tier Message Scheduling for IoT-Based Urban Emergency Systems Through Semantic Priority Override. IEEE Access, 14, 140988–141015. Publisher: IEEE. DOI: 10.1109/ACCESS.2026.3732592. https://doi.org/10.1109/ACCESS.2026.3732592</w:t>
+      </w:r>
+    </w:p>
+    <w:p>
+      <w:r>
+        <w:t>Relevance: TRIAGE/4 combines semantic alarm priority and device fairness with simulation and an MQTT prototype.</w:t>
+      </w:r>
+    </w:p>
+    <w:p>
+      <w:r>
+        <w:t>Complete verification links and access limitations are maintained in docs/related-work.md. Journal quartiles and indexing were not assessed. The candidate policy will be finalized only after full-text comparison with the closest studies.</w:t>
       </w:r>
     </w:p>
     <w:sectPr>

</xml_diff>

<commit_message>
Strengthen proposal with verified related work and reproducible baseline pilot (#3)
</commit_message>
<xml_diff>
--- a/docx/IoT_Alert_Processing_Research_Proposal.docx
+++ b/docx/IoT_Alert_Processing_Research_Proposal.docx
@@ -38,7 +38,7 @@
     </w:p>
     <w:p>
       <w:r>
-        <w:t>Consider a monitoring gateway receiving device tampering alerts, repeated authentication failure alerts, and routine device status messages. During a burst, the processing queue can grow. The application must decide which waiting message to process next. Alert severity is supplied by a trusted test configuration; detecting attacks is outside this study.</w:t>
+        <w:t>The target is a building or small industrial gateway that enriches already-classified security events with device context and records an outcome. Tampering alerts are high priority, repeated authentication failures medium, and device health events low. During incident bursts, a single application worker may fall behind MQTT delivery. This is a bottleneck hypothesis to measure, not a measured deployment fact. The pilot uses synthetic class labels and a 10 ms processing cost; it does not detect attacks.</w:t>
       </w:r>
     </w:p>
     <w:p>
@@ -87,7 +87,7 @@
     </w:p>
     <w:p>
       <w:r>
-        <w:t>The scheduler operates in an application worker after MQTT delivery. It does not change the broker, transport protocol or MQTT delivery guarantees. The expected contribution is a clearly specified policy plus a reproducible evaluation of its operating limits. Aging and priority scheduling are established ideas. Algorithmic novelty remains a hypothesis until a focused related-work comparison is complete. No hard real-time guarantee or publication outcome is assumed.</w:t>
+        <w:t>The scheduler runs after MQTT delivery. Its proposed contribution is an empirically tested decision rule for balancing urgent deadlines and routine waiting at a bounded application queue. Existing MQTT work already addresses priority and fairness, including R8. Queue location alone does not establish novelty. Full comparison with the closest prior work is required before freezing an algorithmic contribution. No hard timing guarantee is claimed.</w:t>
       </w:r>
     </w:p>
     <w:p>
@@ -101,12 +101,12 @@
     </w:p>
     <w:p>
       <w:r>
-        <w:t>The pipeline contains a configurable event generator, a Mosquitto broker, a validating receiver, a bounded scheduling queue, one processing worker and a metrics recorder. A separate discrete-event simulator supports repeatable tests. Both paths will use the same policy interface and workload configuration wherever practical.</w:t>
+        <w:t>The planned pipeline contains an event generator, unmodified Mosquitto broker, validating receiver, bounded queue, one enrichment worker and a metrics recorder. Instrument broker forwarding, enqueue, queue residence and processing separately. Proceed with the worker-queue claim only if that stage is a material bottleneck. The current pilot uses an unbounded queue; bounded admission remains future implementation.</w:t>
       </w:r>
     </w:p>
     <w:p>
       <w:r>
-        <w:t>Each event carries event_id, device_id, event_type, severity, creation time and a configured relative deadline. The receiver assigns an arrival sequence and local monotonic timestamps. Deadlines are application requirements supplied by the experiment, not security properties derived from MQTT QoS.</w:t>
+        <w:t>Planned event fields are event_id, device_id, event_type, trusted severity, creation time and relative deadline. Receiver-local timestamps use a monotonic clock. The 100, 500 and 2000 ms deadlines are illustrative service budgets, not field requirements. Validate them with an operator and sweep them in sensitivity tests. See docs/application-scenario.md for the measurement and trust boundaries.</w:t>
       </w:r>
     </w:p>
     <w:tbl>
@@ -1311,32 +1311,2046 @@
         <w:pageBreakBefore/>
       </w:pPr>
       <w:r>
-        <w:t>Initial reference foundation</w:t>
+        <w:t>Related work on priority and delivery</w:t>
       </w:r>
     </w:p>
     <w:p>
       <w:r>
-        <w:t>[1] C. L. Liu and James W. Layland. 1973. Scheduling Algorithms for Multiprogramming in a Hard-Real-Time Environment. Journal of the ACM, 20(1), 46–61. Publisher: Association for Computing Machinery. DOI: 10.1145/321738.321743. https://dl.acm.org/doi/10.1145/321738.321743</w:t>
+        <w:t>The focused review below uses eight verified publications from 2019 to 2026. Verification concerns identity and bibliographic details; some full texts were unavailable. Abstract-based comparisons are explicitly limited. This is not a systematic review or a ranking of publication venues.</w:t>
+      </w:r>
+    </w:p>
+    <w:tbl>
+      <w:tblPr>
+        <w:tblW w:type="auto" w:w="0"/>
+        <w:tblLayout w:type="fixed"/>
+        <w:tblLook w:firstColumn="1" w:firstRow="1" w:lastColumn="0" w:lastRow="0" w:noHBand="0" w:noVBand="1" w:val="04A0"/>
+      </w:tblPr>
+      <w:tblGrid>
+        <w:gridCol w:w="936"/>
+        <w:gridCol w:w="3240"/>
+        <w:gridCol w:w="5760"/>
+      </w:tblGrid>
+      <w:tr>
+        <w:trPr>
+          <w:cantSplit/>
+          <w:tblHeader/>
+        </w:trPr>
+        <w:tc>
+          <w:tcPr>
+            <w:tcW w:type="dxa" w:w="936"/>
+            <w:tcBorders>
+              <w:top w:val="single" w:color="D9D9D9" w:sz="4"/>
+              <w:bottom w:val="single" w:color="D9D9D9" w:sz="4"/>
+              <w:left w:val="single" w:color="D9D9D9" w:sz="4"/>
+              <w:right w:val="single" w:color="D9D9D9" w:sz="4"/>
+            </w:tcBorders>
+            <w:shd w:fill="E8EEF4"/>
+          </w:tcPr>
+          <w:p>
+            <w:pPr>
+              <w:spacing w:before="100" w:after="100"/>
+            </w:pPr>
+            <w:r>
+              <w:rPr>
+                <w:b/>
+                <w:sz w:val="20"/>
+              </w:rPr>
+              <w:t>Study</w:t>
+            </w:r>
+          </w:p>
+        </w:tc>
+        <w:tc>
+          <w:tcPr>
+            <w:tcW w:type="dxa" w:w="3240"/>
+            <w:tcBorders>
+              <w:top w:val="single" w:color="D9D9D9" w:sz="4"/>
+              <w:bottom w:val="single" w:color="D9D9D9" w:sz="4"/>
+              <w:left w:val="single" w:color="D9D9D9" w:sz="4"/>
+              <w:right w:val="single" w:color="D9D9D9" w:sz="4"/>
+            </w:tcBorders>
+            <w:shd w:fill="E8EEF4"/>
+          </w:tcPr>
+          <w:p>
+            <w:pPr>
+              <w:spacing w:before="100" w:after="100"/>
+            </w:pPr>
+            <w:r>
+              <w:rPr>
+                <w:b/>
+                <w:sz w:val="20"/>
+              </w:rPr>
+              <w:t>Established approach</w:t>
+            </w:r>
+          </w:p>
+        </w:tc>
+        <w:tc>
+          <w:tcPr>
+            <w:tcW w:type="dxa" w:w="5760"/>
+            <w:tcBorders>
+              <w:top w:val="single" w:color="D9D9D9" w:sz="4"/>
+              <w:bottom w:val="single" w:color="D9D9D9" w:sz="4"/>
+              <w:left w:val="single" w:color="D9D9D9" w:sz="4"/>
+              <w:right w:val="single" w:color="D9D9D9" w:sz="4"/>
+            </w:tcBorders>
+            <w:shd w:fill="E8EEF4"/>
+          </w:tcPr>
+          <w:p>
+            <w:pPr>
+              <w:spacing w:before="100" w:after="100"/>
+            </w:pPr>
+            <w:r>
+              <w:rPr>
+                <w:b/>
+                <w:sz w:val="20"/>
+              </w:rPr>
+              <w:t>Implication for this project</w:t>
+            </w:r>
+          </w:p>
+        </w:tc>
+      </w:tr>
+      <w:tr>
+        <w:trPr>
+          <w:cantSplit/>
+        </w:trPr>
+        <w:tc>
+          <w:tcPr>
+            <w:tcW w:type="dxa" w:w="936"/>
+            <w:tcBorders>
+              <w:top w:val="single" w:color="D9D9D9" w:sz="4"/>
+              <w:bottom w:val="single" w:color="D9D9D9" w:sz="4"/>
+              <w:left w:val="single" w:color="D9D9D9" w:sz="4"/>
+              <w:right w:val="single" w:color="D9D9D9" w:sz="4"/>
+            </w:tcBorders>
+          </w:tcPr>
+          <w:p>
+            <w:pPr>
+              <w:spacing w:before="100" w:after="100"/>
+            </w:pPr>
+            <w:r>
+              <w:rPr>
+                <w:b w:val="0"/>
+                <w:sz w:val="20"/>
+              </w:rPr>
+              <w:t>R1 2024</w:t>
+            </w:r>
+          </w:p>
+        </w:tc>
+        <w:tc>
+          <w:tcPr>
+            <w:tcW w:type="dxa" w:w="3240"/>
+            <w:tcBorders>
+              <w:top w:val="single" w:color="D9D9D9" w:sz="4"/>
+              <w:bottom w:val="single" w:color="D9D9D9" w:sz="4"/>
+              <w:left w:val="single" w:color="D9D9D9" w:sz="4"/>
+              <w:right w:val="single" w:color="D9D9D9" w:sz="4"/>
+            </w:tcBorders>
+          </w:tcPr>
+          <w:p>
+            <w:pPr>
+              <w:spacing w:before="100" w:after="100"/>
+            </w:pPr>
+            <w:r>
+              <w:rPr>
+                <w:b w:val="0"/>
+                <w:sz w:val="20"/>
+              </w:rPr>
+              <w:t>Prioritizes time-critical traffic using a UDP-based MQTT extension.</w:t>
+            </w:r>
+          </w:p>
+        </w:tc>
+        <w:tc>
+          <w:tcPr>
+            <w:tcW w:type="dxa" w:w="5760"/>
+            <w:tcBorders>
+              <w:top w:val="single" w:color="D9D9D9" w:sz="4"/>
+              <w:bottom w:val="single" w:color="D9D9D9" w:sz="4"/>
+              <w:left w:val="single" w:color="D9D9D9" w:sz="4"/>
+              <w:right w:val="single" w:color="D9D9D9" w:sz="4"/>
+            </w:tcBorders>
+          </w:tcPr>
+          <w:p>
+            <w:pPr>
+              <w:spacing w:before="100" w:after="100"/>
+            </w:pPr>
+            <w:r>
+              <w:rPr>
+                <w:b w:val="0"/>
+                <w:sz w:val="20"/>
+              </w:rPr>
+              <w:t>Transport and protocol intervention; our queue is after delivery. No direct performance comparison is valid without matching the network model.</w:t>
+            </w:r>
+          </w:p>
+        </w:tc>
+      </w:tr>
+      <w:tr>
+        <w:trPr>
+          <w:cantSplit/>
+        </w:trPr>
+        <w:tc>
+          <w:tcPr>
+            <w:tcW w:type="dxa" w:w="936"/>
+            <w:tcBorders>
+              <w:top w:val="single" w:color="D9D9D9" w:sz="4"/>
+              <w:bottom w:val="single" w:color="D9D9D9" w:sz="4"/>
+              <w:left w:val="single" w:color="D9D9D9" w:sz="4"/>
+              <w:right w:val="single" w:color="D9D9D9" w:sz="4"/>
+            </w:tcBorders>
+          </w:tcPr>
+          <w:p>
+            <w:pPr>
+              <w:spacing w:before="100" w:after="100"/>
+            </w:pPr>
+            <w:r>
+              <w:rPr>
+                <w:b w:val="0"/>
+                <w:sz w:val="20"/>
+              </w:rPr>
+              <w:t>R2 2024</w:t>
+            </w:r>
+          </w:p>
+        </w:tc>
+        <w:tc>
+          <w:tcPr>
+            <w:tcW w:type="dxa" w:w="3240"/>
+            <w:tcBorders>
+              <w:top w:val="single" w:color="D9D9D9" w:sz="4"/>
+              <w:bottom w:val="single" w:color="D9D9D9" w:sz="4"/>
+              <w:left w:val="single" w:color="D9D9D9" w:sz="4"/>
+              <w:right w:val="single" w:color="D9D9D9" w:sz="4"/>
+            </w:tcBorders>
+          </w:tcPr>
+          <w:p>
+            <w:pPr>
+              <w:spacing w:before="100" w:after="100"/>
+            </w:pPr>
+            <w:r>
+              <w:rPr>
+                <w:b w:val="0"/>
+                <w:sz w:val="20"/>
+              </w:rPr>
+              <w:t>RabbitMQ virtual queues distinguish urgent, critical and FCFS messages.</w:t>
+            </w:r>
+          </w:p>
+        </w:tc>
+        <w:tc>
+          <w:tcPr>
+            <w:tcW w:type="dxa" w:w="5760"/>
+            <w:tcBorders>
+              <w:top w:val="single" w:color="D9D9D9" w:sz="4"/>
+              <w:bottom w:val="single" w:color="D9D9D9" w:sz="4"/>
+              <w:left w:val="single" w:color="D9D9D9" w:sz="4"/>
+              <w:right w:val="single" w:color="D9D9D9" w:sz="4"/>
+            </w:tcBorders>
+          </w:tcPr>
+          <w:p>
+            <w:pPr>
+              <w:spacing w:before="100" w:after="100"/>
+            </w:pPr>
+            <w:r>
+              <w:rPr>
+                <w:b w:val="0"/>
+                <w:sz w:val="20"/>
+              </w:rPr>
+              <w:t>Shows that emergency priority queues already exist. We will examine routine waiting and repeated overload rather than claim priority support itself as new.</w:t>
+            </w:r>
+          </w:p>
+        </w:tc>
+      </w:tr>
+      <w:tr>
+        <w:trPr>
+          <w:cantSplit/>
+        </w:trPr>
+        <w:tc>
+          <w:tcPr>
+            <w:tcW w:type="dxa" w:w="936"/>
+            <w:tcBorders>
+              <w:top w:val="single" w:color="D9D9D9" w:sz="4"/>
+              <w:bottom w:val="single" w:color="D9D9D9" w:sz="4"/>
+              <w:left w:val="single" w:color="D9D9D9" w:sz="4"/>
+              <w:right w:val="single" w:color="D9D9D9" w:sz="4"/>
+            </w:tcBorders>
+          </w:tcPr>
+          <w:p>
+            <w:pPr>
+              <w:spacing w:before="100" w:after="100"/>
+            </w:pPr>
+            <w:r>
+              <w:rPr>
+                <w:b w:val="0"/>
+                <w:sz w:val="20"/>
+              </w:rPr>
+              <w:t>R3 2024</w:t>
+            </w:r>
+          </w:p>
+        </w:tc>
+        <w:tc>
+          <w:tcPr>
+            <w:tcW w:type="dxa" w:w="3240"/>
+            <w:tcBorders>
+              <w:top w:val="single" w:color="D9D9D9" w:sz="4"/>
+              <w:bottom w:val="single" w:color="D9D9D9" w:sz="4"/>
+              <w:left w:val="single" w:color="D9D9D9" w:sz="4"/>
+              <w:right w:val="single" w:color="D9D9D9" w:sz="4"/>
+            </w:tcBorders>
+          </w:tcPr>
+          <w:p>
+            <w:pPr>
+              <w:spacing w:before="100" w:after="100"/>
+            </w:pPr>
+            <w:r>
+              <w:rPr>
+                <w:b w:val="0"/>
+                <w:sz w:val="20"/>
+              </w:rPr>
+              <w:t>Combines selective transmission and urgent-message processing in HBMQTT.</w:t>
+            </w:r>
+          </w:p>
+        </w:tc>
+        <w:tc>
+          <w:tcPr>
+            <w:tcW w:type="dxa" w:w="5760"/>
+            <w:tcBorders>
+              <w:top w:val="single" w:color="D9D9D9" w:sz="4"/>
+              <w:bottom w:val="single" w:color="D9D9D9" w:sz="4"/>
+              <w:left w:val="single" w:color="D9D9D9" w:sz="4"/>
+              <w:right w:val="single" w:color="D9D9D9" w:sz="4"/>
+            </w:tcBorders>
+          </w:tcPr>
+          <w:p>
+            <w:pPr>
+              <w:spacing w:before="100" w:after="100"/>
+            </w:pPr>
+            <w:r>
+              <w:rPr>
+                <w:b w:val="0"/>
+                <w:sz w:val="20"/>
+              </w:rPr>
+              <w:t>Traffic suppression changes the offered workload; our initial comparisons keep identical input traces. Full text is needed before making absence claims.</w:t>
+            </w:r>
+          </w:p>
+        </w:tc>
+      </w:tr>
+      <w:tr>
+        <w:trPr>
+          <w:cantSplit/>
+        </w:trPr>
+        <w:tc>
+          <w:tcPr>
+            <w:tcW w:type="dxa" w:w="936"/>
+            <w:tcBorders>
+              <w:top w:val="single" w:color="D9D9D9" w:sz="4"/>
+              <w:bottom w:val="single" w:color="D9D9D9" w:sz="4"/>
+              <w:left w:val="single" w:color="D9D9D9" w:sz="4"/>
+              <w:right w:val="single" w:color="D9D9D9" w:sz="4"/>
+            </w:tcBorders>
+          </w:tcPr>
+          <w:p>
+            <w:pPr>
+              <w:spacing w:before="100" w:after="100"/>
+            </w:pPr>
+            <w:r>
+              <w:rPr>
+                <w:b w:val="0"/>
+                <w:sz w:val="20"/>
+              </w:rPr>
+              <w:t>R4 2024</w:t>
+            </w:r>
+          </w:p>
+        </w:tc>
+        <w:tc>
+          <w:tcPr>
+            <w:tcW w:type="dxa" w:w="3240"/>
+            <w:tcBorders>
+              <w:top w:val="single" w:color="D9D9D9" w:sz="4"/>
+              <w:bottom w:val="single" w:color="D9D9D9" w:sz="4"/>
+              <w:left w:val="single" w:color="D9D9D9" w:sz="4"/>
+              <w:right w:val="single" w:color="D9D9D9" w:sz="4"/>
+            </w:tcBorders>
+          </w:tcPr>
+          <w:p>
+            <w:pPr>
+              <w:spacing w:before="100" w:after="100"/>
+            </w:pPr>
+            <w:r>
+              <w:rPr>
+                <w:b w:val="0"/>
+                <w:sz w:val="20"/>
+              </w:rPr>
+              <w:t>Explores integrating PrioMQTT with TSN for traffic with diverse timing needs.</w:t>
+            </w:r>
+          </w:p>
+        </w:tc>
+        <w:tc>
+          <w:tcPr>
+            <w:tcW w:type="dxa" w:w="5760"/>
+            <w:tcBorders>
+              <w:top w:val="single" w:color="D9D9D9" w:sz="4"/>
+              <w:bottom w:val="single" w:color="D9D9D9" w:sz="4"/>
+              <w:left w:val="single" w:color="D9D9D9" w:sz="4"/>
+              <w:right w:val="single" w:color="D9D9D9" w:sz="4"/>
+            </w:tcBorders>
+          </w:tcPr>
+          <w:p>
+            <w:pPr>
+              <w:spacing w:before="100" w:after="100"/>
+            </w:pPr>
+            <w:r>
+              <w:rPr>
+                <w:b w:val="0"/>
+                <w:sz w:val="20"/>
+              </w:rPr>
+              <w:t>Network support matters for timing bounds. We make no network-level deadline guarantee from an application queue.</w:t>
+            </w:r>
+          </w:p>
+        </w:tc>
+      </w:tr>
+    </w:tbl>
+    <w:p>
+      <w:pPr>
+        <w:spacing w:after="40"/>
+      </w:pPr>
+    </w:p>
+    <w:p>
+      <w:pPr>
+        <w:pStyle w:val="Heading2"/>
+      </w:pPr>
+      <w:r>
+        <w:t>What is already established</w:t>
       </w:r>
     </w:p>
     <w:p>
       <w:r>
-        <w:t>Relevance: provides foundational real-time scheduling context. Its task assumptions and guarantees do not transfer automatically to this non-preemptive MQTT application.</w:t>
+        <w:t>Priority MQTT, separate urgency queues and low-delay delivery are existing research directions. R1 changes transport behavior, R2 uses virtual urgency queues, R3 combines prioritization with traffic reduction, and R4 considers TSN integration. A project that only adds priority to MQTT would overlap these directions.</w:t>
+      </w:r>
+    </w:p>
+    <w:p>
+      <w:pPr>
+        <w:pStyle w:val="Heading2"/>
+      </w:pPr>
+      <w:r>
+        <w:t>Evidence limits</w:t>
       </w:r>
     </w:p>
     <w:p>
       <w:r>
-        <w:t>[2] Andrew Banks, Ed Briggs, Ken Borgendale and Rahul Gupta, editors. 2019. MQTT Version 5.0. OASIS Standard, 7 March 2019. Publisher: OASIS Open. https://docs.oasis-open.org/mqtt/mqtt/v5.0/os/mqtt-v5.0-os.html</w:t>
+        <w:t>R2 was reviewed in full publisher text. R1 and R3 comparisons rely on publisher abstracts and metadata; R4 uses the publisher abstract and indexed author text. These records support the stated approach, not broad claims about every experiment or missing feature. Detailed verification notes and official links are in docs/related-work.md.</w:t>
+      </w:r>
+    </w:p>
+    <w:p>
+      <w:pPr>
+        <w:pStyle w:val="Heading1"/>
+        <w:pageBreakBefore/>
+      </w:pPr>
+      <w:r>
+        <w:t>Related work on timing and fairness</w:t>
+      </w:r>
+    </w:p>
+    <w:tbl>
+      <w:tblPr>
+        <w:tblW w:type="auto" w:w="0"/>
+        <w:tblLayout w:type="fixed"/>
+        <w:tblLook w:firstColumn="1" w:firstRow="1" w:lastColumn="0" w:lastRow="0" w:noHBand="0" w:noVBand="1" w:val="04A0"/>
+      </w:tblPr>
+      <w:tblGrid>
+        <w:gridCol w:w="936"/>
+        <w:gridCol w:w="3240"/>
+        <w:gridCol w:w="5760"/>
+      </w:tblGrid>
+      <w:tr>
+        <w:trPr>
+          <w:cantSplit/>
+          <w:tblHeader/>
+        </w:trPr>
+        <w:tc>
+          <w:tcPr>
+            <w:tcW w:type="dxa" w:w="936"/>
+            <w:tcBorders>
+              <w:top w:val="single" w:color="D9D9D9" w:sz="4"/>
+              <w:bottom w:val="single" w:color="D9D9D9" w:sz="4"/>
+              <w:left w:val="single" w:color="D9D9D9" w:sz="4"/>
+              <w:right w:val="single" w:color="D9D9D9" w:sz="4"/>
+            </w:tcBorders>
+            <w:shd w:fill="E8EEF4"/>
+          </w:tcPr>
+          <w:p>
+            <w:pPr>
+              <w:spacing w:before="100" w:after="100"/>
+            </w:pPr>
+            <w:r>
+              <w:rPr>
+                <w:b/>
+                <w:sz w:val="20"/>
+              </w:rPr>
+              <w:t>Study</w:t>
+            </w:r>
+          </w:p>
+        </w:tc>
+        <w:tc>
+          <w:tcPr>
+            <w:tcW w:type="dxa" w:w="3240"/>
+            <w:tcBorders>
+              <w:top w:val="single" w:color="D9D9D9" w:sz="4"/>
+              <w:bottom w:val="single" w:color="D9D9D9" w:sz="4"/>
+              <w:left w:val="single" w:color="D9D9D9" w:sz="4"/>
+              <w:right w:val="single" w:color="D9D9D9" w:sz="4"/>
+            </w:tcBorders>
+            <w:shd w:fill="E8EEF4"/>
+          </w:tcPr>
+          <w:p>
+            <w:pPr>
+              <w:spacing w:before="100" w:after="100"/>
+            </w:pPr>
+            <w:r>
+              <w:rPr>
+                <w:b/>
+                <w:sz w:val="20"/>
+              </w:rPr>
+              <w:t>Established approach</w:t>
+            </w:r>
+          </w:p>
+        </w:tc>
+        <w:tc>
+          <w:tcPr>
+            <w:tcW w:type="dxa" w:w="5760"/>
+            <w:tcBorders>
+              <w:top w:val="single" w:color="D9D9D9" w:sz="4"/>
+              <w:bottom w:val="single" w:color="D9D9D9" w:sz="4"/>
+              <w:left w:val="single" w:color="D9D9D9" w:sz="4"/>
+              <w:right w:val="single" w:color="D9D9D9" w:sz="4"/>
+            </w:tcBorders>
+            <w:shd w:fill="E8EEF4"/>
+          </w:tcPr>
+          <w:p>
+            <w:pPr>
+              <w:spacing w:before="100" w:after="100"/>
+            </w:pPr>
+            <w:r>
+              <w:rPr>
+                <w:b/>
+                <w:sz w:val="20"/>
+              </w:rPr>
+              <w:t>Implication for this project</w:t>
+            </w:r>
+          </w:p>
+        </w:tc>
+      </w:tr>
+      <w:tr>
+        <w:trPr>
+          <w:cantSplit/>
+        </w:trPr>
+        <w:tc>
+          <w:tcPr>
+            <w:tcW w:type="dxa" w:w="936"/>
+            <w:tcBorders>
+              <w:top w:val="single" w:color="D9D9D9" w:sz="4"/>
+              <w:bottom w:val="single" w:color="D9D9D9" w:sz="4"/>
+              <w:left w:val="single" w:color="D9D9D9" w:sz="4"/>
+              <w:right w:val="single" w:color="D9D9D9" w:sz="4"/>
+            </w:tcBorders>
+          </w:tcPr>
+          <w:p>
+            <w:pPr>
+              <w:spacing w:before="100" w:after="100"/>
+            </w:pPr>
+            <w:r>
+              <w:rPr>
+                <w:b w:val="0"/>
+                <w:sz w:val="20"/>
+              </w:rPr>
+              <w:t>R5 2022</w:t>
+            </w:r>
+          </w:p>
+        </w:tc>
+        <w:tc>
+          <w:tcPr>
+            <w:tcW w:type="dxa" w:w="3240"/>
+            <w:tcBorders>
+              <w:top w:val="single" w:color="D9D9D9" w:sz="4"/>
+              <w:bottom w:val="single" w:color="D9D9D9" w:sz="4"/>
+              <w:left w:val="single" w:color="D9D9D9" w:sz="4"/>
+              <w:right w:val="single" w:color="D9D9D9" w:sz="4"/>
+            </w:tcBorders>
+          </w:tcPr>
+          <w:p>
+            <w:pPr>
+              <w:spacing w:before="100" w:after="100"/>
+            </w:pPr>
+            <w:r>
+              <w:rPr>
+                <w:b w:val="0"/>
+                <w:sz w:val="20"/>
+              </w:rPr>
+              <w:t>Maps application timing requirements to SDN resource reservations.</w:t>
+            </w:r>
+          </w:p>
+        </w:tc>
+        <w:tc>
+          <w:tcPr>
+            <w:tcW w:type="dxa" w:w="5760"/>
+            <w:tcBorders>
+              <w:top w:val="single" w:color="D9D9D9" w:sz="4"/>
+              <w:bottom w:val="single" w:color="D9D9D9" w:sz="4"/>
+              <w:left w:val="single" w:color="D9D9D9" w:sz="4"/>
+              <w:right w:val="single" w:color="D9D9D9" w:sz="4"/>
+            </w:tcBorders>
+          </w:tcPr>
+          <w:p>
+            <w:pPr>
+              <w:spacing w:before="100" w:after="100"/>
+            </w:pPr>
+            <w:r>
+              <w:rPr>
+                <w:b w:val="0"/>
+                <w:sz w:val="20"/>
+              </w:rPr>
+              <w:t>A broader architecture than our worker queue. Its treatment of ordinary-traffic cost motivates reporting both event classes.</w:t>
+            </w:r>
+          </w:p>
+        </w:tc>
+      </w:tr>
+      <w:tr>
+        <w:trPr>
+          <w:cantSplit/>
+        </w:trPr>
+        <w:tc>
+          <w:tcPr>
+            <w:tcW w:type="dxa" w:w="936"/>
+            <w:tcBorders>
+              <w:top w:val="single" w:color="D9D9D9" w:sz="4"/>
+              <w:bottom w:val="single" w:color="D9D9D9" w:sz="4"/>
+              <w:left w:val="single" w:color="D9D9D9" w:sz="4"/>
+              <w:right w:val="single" w:color="D9D9D9" w:sz="4"/>
+            </w:tcBorders>
+          </w:tcPr>
+          <w:p>
+            <w:pPr>
+              <w:spacing w:before="100" w:after="100"/>
+            </w:pPr>
+            <w:r>
+              <w:rPr>
+                <w:b w:val="0"/>
+                <w:sz w:val="20"/>
+              </w:rPr>
+              <w:t>R6 2023</w:t>
+            </w:r>
+          </w:p>
+        </w:tc>
+        <w:tc>
+          <w:tcPr>
+            <w:tcW w:type="dxa" w:w="3240"/>
+            <w:tcBorders>
+              <w:top w:val="single" w:color="D9D9D9" w:sz="4"/>
+              <w:bottom w:val="single" w:color="D9D9D9" w:sz="4"/>
+              <w:left w:val="single" w:color="D9D9D9" w:sz="4"/>
+              <w:right w:val="single" w:color="D9D9D9" w:sz="4"/>
+            </w:tcBorders>
+          </w:tcPr>
+          <w:p>
+            <w:pPr>
+              <w:spacing w:before="100" w:after="100"/>
+            </w:pPr>
+            <w:r>
+              <w:rPr>
+                <w:b w:val="0"/>
+                <w:sz w:val="20"/>
+              </w:rPr>
+              <w:t>Derives worst-case response-time analysis for an SDN-based MQTT architecture.</w:t>
+            </w:r>
+          </w:p>
+        </w:tc>
+        <w:tc>
+          <w:tcPr>
+            <w:tcW w:type="dxa" w:w="5760"/>
+            <w:tcBorders>
+              <w:top w:val="single" w:color="D9D9D9" w:sz="4"/>
+              <w:bottom w:val="single" w:color="D9D9D9" w:sz="4"/>
+              <w:left w:val="single" w:color="D9D9D9" w:sz="4"/>
+              <w:right w:val="single" w:color="D9D9D9" w:sz="4"/>
+            </w:tcBorders>
+          </w:tcPr>
+          <w:p>
+            <w:pPr>
+              <w:spacing w:before="100" w:after="100"/>
+            </w:pPr>
+            <w:r>
+              <w:rPr>
+                <w:b w:val="0"/>
+                <w:sz w:val="20"/>
+              </w:rPr>
+              <w:t>A formal guarantee requires an explicit analyzable model. Our initial results are empirical finite-workload measurements.</w:t>
+            </w:r>
+          </w:p>
+        </w:tc>
+      </w:tr>
+      <w:tr>
+        <w:trPr>
+          <w:cantSplit/>
+        </w:trPr>
+        <w:tc>
+          <w:tcPr>
+            <w:tcW w:type="dxa" w:w="936"/>
+            <w:tcBorders>
+              <w:top w:val="single" w:color="D9D9D9" w:sz="4"/>
+              <w:bottom w:val="single" w:color="D9D9D9" w:sz="4"/>
+              <w:left w:val="single" w:color="D9D9D9" w:sz="4"/>
+              <w:right w:val="single" w:color="D9D9D9" w:sz="4"/>
+            </w:tcBorders>
+          </w:tcPr>
+          <w:p>
+            <w:pPr>
+              <w:spacing w:before="100" w:after="100"/>
+            </w:pPr>
+            <w:r>
+              <w:rPr>
+                <w:b w:val="0"/>
+                <w:sz w:val="20"/>
+              </w:rPr>
+              <w:t>R7 2019</w:t>
+            </w:r>
+          </w:p>
+        </w:tc>
+        <w:tc>
+          <w:tcPr>
+            <w:tcW w:type="dxa" w:w="3240"/>
+            <w:tcBorders>
+              <w:top w:val="single" w:color="D9D9D9" w:sz="4"/>
+              <w:bottom w:val="single" w:color="D9D9D9" w:sz="4"/>
+              <w:left w:val="single" w:color="D9D9D9" w:sz="4"/>
+              <w:right w:val="single" w:color="D9D9D9" w:sz="4"/>
+            </w:tcBorders>
+          </w:tcPr>
+          <w:p>
+            <w:pPr>
+              <w:spacing w:before="100" w:after="100"/>
+            </w:pPr>
+            <w:r>
+              <w:rPr>
+                <w:b w:val="0"/>
+                <w:sz w:val="20"/>
+              </w:rPr>
+              <w:t>Modifies Mosquitto for urgent message delivery.</w:t>
+            </w:r>
+          </w:p>
+        </w:tc>
+        <w:tc>
+          <w:tcPr>
+            <w:tcW w:type="dxa" w:w="5760"/>
+            <w:tcBorders>
+              <w:top w:val="single" w:color="D9D9D9" w:sz="4"/>
+              <w:bottom w:val="single" w:color="D9D9D9" w:sz="4"/>
+              <w:left w:val="single" w:color="D9D9D9" w:sz="4"/>
+              <w:right w:val="single" w:color="D9D9D9" w:sz="4"/>
+            </w:tcBorders>
+          </w:tcPr>
+          <w:p>
+            <w:pPr>
+              <w:spacing w:before="100" w:after="100"/>
+            </w:pPr>
+            <w:r>
+              <w:rPr>
+                <w:b w:val="0"/>
+                <w:sz w:val="20"/>
+              </w:rPr>
+              <w:t>Prior art for broker-level urgency. Detailed algorithm and evaluation limitations remain unassessed because full text was unavailable.</w:t>
+            </w:r>
+          </w:p>
+        </w:tc>
+      </w:tr>
+      <w:tr>
+        <w:trPr>
+          <w:cantSplit/>
+        </w:trPr>
+        <w:tc>
+          <w:tcPr>
+            <w:tcW w:type="dxa" w:w="936"/>
+            <w:tcBorders>
+              <w:top w:val="single" w:color="D9D9D9" w:sz="4"/>
+              <w:bottom w:val="single" w:color="D9D9D9" w:sz="4"/>
+              <w:left w:val="single" w:color="D9D9D9" w:sz="4"/>
+              <w:right w:val="single" w:color="D9D9D9" w:sz="4"/>
+            </w:tcBorders>
+          </w:tcPr>
+          <w:p>
+            <w:pPr>
+              <w:spacing w:before="100" w:after="100"/>
+            </w:pPr>
+            <w:r>
+              <w:rPr>
+                <w:b w:val="0"/>
+                <w:sz w:val="20"/>
+              </w:rPr>
+              <w:t>R8 2026</w:t>
+            </w:r>
+          </w:p>
+        </w:tc>
+        <w:tc>
+          <w:tcPr>
+            <w:tcW w:type="dxa" w:w="3240"/>
+            <w:tcBorders>
+              <w:top w:val="single" w:color="D9D9D9" w:sz="4"/>
+              <w:bottom w:val="single" w:color="D9D9D9" w:sz="4"/>
+              <w:left w:val="single" w:color="D9D9D9" w:sz="4"/>
+              <w:right w:val="single" w:color="D9D9D9" w:sz="4"/>
+            </w:tcBorders>
+          </w:tcPr>
+          <w:p>
+            <w:pPr>
+              <w:spacing w:before="100" w:after="100"/>
+            </w:pPr>
+            <w:r>
+              <w:rPr>
+                <w:b w:val="0"/>
+                <w:sz w:val="20"/>
+              </w:rPr>
+              <w:t>TRIAGE/4 combines semantic alarm priority and device fairness with simulation and an MQTT prototype.</w:t>
+            </w:r>
+          </w:p>
+        </w:tc>
+        <w:tc>
+          <w:tcPr>
+            <w:tcW w:type="dxa" w:w="5760"/>
+            <w:tcBorders>
+              <w:top w:val="single" w:color="D9D9D9" w:sz="4"/>
+              <w:bottom w:val="single" w:color="D9D9D9" w:sz="4"/>
+              <w:left w:val="single" w:color="D9D9D9" w:sz="4"/>
+              <w:right w:val="single" w:color="D9D9D9" w:sz="4"/>
+            </w:tcBorders>
+          </w:tcPr>
+          <w:p>
+            <w:pPr>
+              <w:spacing w:before="100" w:after="100"/>
+            </w:pPr>
+            <w:r>
+              <w:rPr>
+                <w:b w:val="0"/>
+                <w:sz w:val="20"/>
+              </w:rPr>
+              <w:t>Closest conceptual overlap: alarm latency and fairness are already studied. Any novelty claim needs a full comparison with this method, not just FIFO and strict priority.</w:t>
+            </w:r>
+          </w:p>
+        </w:tc>
+      </w:tr>
+    </w:tbl>
+    <w:p>
+      <w:pPr>
+        <w:spacing w:after="40"/>
+      </w:pPr>
+    </w:p>
+    <w:p>
+      <w:pPr>
+        <w:pStyle w:val="Heading2"/>
+      </w:pPr>
+      <w:r>
+        <w:t>Candidate gap and design decision</w:t>
       </w:r>
     </w:p>
     <w:p>
       <w:r>
-        <w:t>Relevance: defines MQTT messaging and delivery semantics. The current prototype uses the client default MQTT 3.1.1; protocol version and QoS will be explicitly fixed for evaluation.</w:t>
+        <w:t>For a bounded, non-preemptive worker after MQTT delivery, we will test whether occupancy-dependent aging improves the urgent-deadline versus routine-waiting tradeoff beyond tuned fixed aging and EDF, including dispatch overhead and lost work. This is a candidate empirical gap, not proof of absence in prior work.</w:t>
       </w:r>
     </w:p>
     <w:p>
       <w:r>
-        <w:t>Before freezing the policy, extend the literature matrix with recent verified MQTT priority, deadline and fairness studies. Compare decision rules, queue location, workloads and limitations. This foundation does not establish a unique research gap.</w:t>
+        <w:t>R8 is the closest conceptual overlap because it already combines alarm priority and fairness. Obtain its full algorithm, then reproduce a relevant policy or justify why its model is incompatible with this queue. Consider a fair-share baseline if device monopolization is studied. If the candidate remains only a rearrangement of existing ideas, redesign the contribution or pursue a distinct empirical finding.</w:t>
+      </w:r>
+    </w:p>
+    <w:p>
+      <w:r>
+        <w:t>R5 was read as a full author article in PMC; R6 was checked through its publisher record and abstract. R7 is a bibliographic prior-art check, not a full methodological appraisal. R8 uses its publisher abstract and author publication list. No absence claim is made from inaccessible text.</w:t>
+      </w:r>
+    </w:p>
+    <w:p>
+      <w:pPr>
+        <w:pStyle w:val="Heading1"/>
+        <w:pageBreakBefore/>
+      </w:pPr>
+      <w:r>
+        <w:t>Baseline pilot and observed tradeoffs</w:t>
+      </w:r>
+    </w:p>
+    <w:p>
+      <w:r>
+        <w:t>A completed pilot compared FIFO, strict priority and fixed aging using ten paired seeds, 1000 events per trace and arrival rates of 50, 90 and 120 events/s. This yields 90 policy runs and 90000 completed event records. Service is constant at 10 ms; aging promotes one class per 100 ms. Each queue is unbounded and drains after arrivals stop. No candidate adaptive method was tested.</w:t>
+      </w:r>
+    </w:p>
+    <w:tbl>
+      <w:tblPr>
+        <w:tblW w:type="auto" w:w="0"/>
+        <w:tblLayout w:type="fixed"/>
+        <w:tblLook w:firstColumn="1" w:firstRow="1" w:lastColumn="0" w:lastRow="0" w:noHBand="0" w:noVBand="1" w:val="04A0"/>
+      </w:tblPr>
+      <w:tblGrid>
+        <w:gridCol w:w="1584"/>
+        <w:gridCol w:w="2448"/>
+        <w:gridCol w:w="2952"/>
+        <w:gridCol w:w="2952"/>
+      </w:tblGrid>
+      <w:tr>
+        <w:trPr>
+          <w:cantSplit/>
+          <w:tblHeader/>
+        </w:trPr>
+        <w:tc>
+          <w:tcPr>
+            <w:tcW w:type="dxa" w:w="1584"/>
+            <w:tcBorders>
+              <w:top w:val="single" w:color="D9D9D9" w:sz="4"/>
+              <w:bottom w:val="single" w:color="D9D9D9" w:sz="4"/>
+              <w:left w:val="single" w:color="D9D9D9" w:sz="4"/>
+              <w:right w:val="single" w:color="D9D9D9" w:sz="4"/>
+            </w:tcBorders>
+            <w:shd w:fill="E8EEF4"/>
+          </w:tcPr>
+          <w:p>
+            <w:pPr>
+              <w:spacing w:before="100" w:after="100"/>
+            </w:pPr>
+            <w:r>
+              <w:rPr>
+                <w:b/>
+                <w:sz w:val="20"/>
+              </w:rPr>
+              <w:t>Events per s</w:t>
+            </w:r>
+          </w:p>
+        </w:tc>
+        <w:tc>
+          <w:tcPr>
+            <w:tcW w:type="dxa" w:w="2448"/>
+            <w:tcBorders>
+              <w:top w:val="single" w:color="D9D9D9" w:sz="4"/>
+              <w:bottom w:val="single" w:color="D9D9D9" w:sz="4"/>
+              <w:left w:val="single" w:color="D9D9D9" w:sz="4"/>
+              <w:right w:val="single" w:color="D9D9D9" w:sz="4"/>
+            </w:tcBorders>
+            <w:shd w:fill="E8EEF4"/>
+          </w:tcPr>
+          <w:p>
+            <w:pPr>
+              <w:spacing w:before="100" w:after="100"/>
+            </w:pPr>
+            <w:r>
+              <w:rPr>
+                <w:b/>
+                <w:sz w:val="20"/>
+              </w:rPr>
+              <w:t>Policy</w:t>
+            </w:r>
+          </w:p>
+        </w:tc>
+        <w:tc>
+          <w:tcPr>
+            <w:tcW w:type="dxa" w:w="2952"/>
+            <w:tcBorders>
+              <w:top w:val="single" w:color="D9D9D9" w:sz="4"/>
+              <w:bottom w:val="single" w:color="D9D9D9" w:sz="4"/>
+              <w:left w:val="single" w:color="D9D9D9" w:sz="4"/>
+              <w:right w:val="single" w:color="D9D9D9" w:sz="4"/>
+            </w:tcBorders>
+            <w:shd w:fill="E8EEF4"/>
+          </w:tcPr>
+          <w:p>
+            <w:pPr>
+              <w:spacing w:before="100" w:after="100"/>
+            </w:pPr>
+            <w:r>
+              <w:rPr>
+                <w:b/>
+                <w:sz w:val="20"/>
+              </w:rPr>
+              <w:t>High p95 ms</w:t>
+            </w:r>
+          </w:p>
+        </w:tc>
+        <w:tc>
+          <w:tcPr>
+            <w:tcW w:type="dxa" w:w="2952"/>
+            <w:tcBorders>
+              <w:top w:val="single" w:color="D9D9D9" w:sz="4"/>
+              <w:bottom w:val="single" w:color="D9D9D9" w:sz="4"/>
+              <w:left w:val="single" w:color="D9D9D9" w:sz="4"/>
+              <w:right w:val="single" w:color="D9D9D9" w:sz="4"/>
+            </w:tcBorders>
+            <w:shd w:fill="E8EEF4"/>
+          </w:tcPr>
+          <w:p>
+            <w:pPr>
+              <w:spacing w:before="100" w:after="100"/>
+            </w:pPr>
+            <w:r>
+              <w:rPr>
+                <w:b/>
+                <w:sz w:val="20"/>
+              </w:rPr>
+              <w:t>Low p95 ms</w:t>
+            </w:r>
+          </w:p>
+        </w:tc>
+      </w:tr>
+      <w:tr>
+        <w:trPr>
+          <w:cantSplit/>
+        </w:trPr>
+        <w:tc>
+          <w:tcPr>
+            <w:tcW w:type="dxa" w:w="1584"/>
+            <w:tcBorders>
+              <w:top w:val="single" w:color="D9D9D9" w:sz="4"/>
+              <w:bottom w:val="single" w:color="D9D9D9" w:sz="4"/>
+              <w:left w:val="single" w:color="D9D9D9" w:sz="4"/>
+              <w:right w:val="single" w:color="D9D9D9" w:sz="4"/>
+            </w:tcBorders>
+          </w:tcPr>
+          <w:p>
+            <w:pPr>
+              <w:spacing w:before="100" w:after="100"/>
+            </w:pPr>
+            <w:r>
+              <w:rPr>
+                <w:b w:val="0"/>
+                <w:sz w:val="20"/>
+              </w:rPr>
+              <w:t>50</w:t>
+            </w:r>
+          </w:p>
+        </w:tc>
+        <w:tc>
+          <w:tcPr>
+            <w:tcW w:type="dxa" w:w="2448"/>
+            <w:tcBorders>
+              <w:top w:val="single" w:color="D9D9D9" w:sz="4"/>
+              <w:bottom w:val="single" w:color="D9D9D9" w:sz="4"/>
+              <w:left w:val="single" w:color="D9D9D9" w:sz="4"/>
+              <w:right w:val="single" w:color="D9D9D9" w:sz="4"/>
+            </w:tcBorders>
+          </w:tcPr>
+          <w:p>
+            <w:pPr>
+              <w:spacing w:before="100" w:after="100"/>
+            </w:pPr>
+            <w:r>
+              <w:rPr>
+                <w:b w:val="0"/>
+                <w:sz w:val="20"/>
+              </w:rPr>
+              <w:t>fifo</w:t>
+            </w:r>
+          </w:p>
+        </w:tc>
+        <w:tc>
+          <w:tcPr>
+            <w:tcW w:type="dxa" w:w="2952"/>
+            <w:tcBorders>
+              <w:top w:val="single" w:color="D9D9D9" w:sz="4"/>
+              <w:bottom w:val="single" w:color="D9D9D9" w:sz="4"/>
+              <w:left w:val="single" w:color="D9D9D9" w:sz="4"/>
+              <w:right w:val="single" w:color="D9D9D9" w:sz="4"/>
+            </w:tcBorders>
+          </w:tcPr>
+          <w:p>
+            <w:pPr>
+              <w:spacing w:before="100" w:after="100"/>
+            </w:pPr>
+            <w:r>
+              <w:rPr>
+                <w:b w:val="0"/>
+                <w:sz w:val="20"/>
+              </w:rPr>
+              <w:t>29.43</w:t>
+            </w:r>
+          </w:p>
+        </w:tc>
+        <w:tc>
+          <w:tcPr>
+            <w:tcW w:type="dxa" w:w="2952"/>
+            <w:tcBorders>
+              <w:top w:val="single" w:color="D9D9D9" w:sz="4"/>
+              <w:bottom w:val="single" w:color="D9D9D9" w:sz="4"/>
+              <w:left w:val="single" w:color="D9D9D9" w:sz="4"/>
+              <w:right w:val="single" w:color="D9D9D9" w:sz="4"/>
+            </w:tcBorders>
+          </w:tcPr>
+          <w:p>
+            <w:pPr>
+              <w:spacing w:before="100" w:after="100"/>
+            </w:pPr>
+            <w:r>
+              <w:rPr>
+                <w:b w:val="0"/>
+                <w:sz w:val="20"/>
+              </w:rPr>
+              <w:t>30.53</w:t>
+            </w:r>
+          </w:p>
+        </w:tc>
+      </w:tr>
+      <w:tr>
+        <w:trPr>
+          <w:cantSplit/>
+        </w:trPr>
+        <w:tc>
+          <w:tcPr>
+            <w:tcW w:type="dxa" w:w="1584"/>
+            <w:tcBorders>
+              <w:top w:val="single" w:color="D9D9D9" w:sz="4"/>
+              <w:bottom w:val="single" w:color="D9D9D9" w:sz="4"/>
+              <w:left w:val="single" w:color="D9D9D9" w:sz="4"/>
+              <w:right w:val="single" w:color="D9D9D9" w:sz="4"/>
+            </w:tcBorders>
+          </w:tcPr>
+          <w:p>
+            <w:pPr>
+              <w:spacing w:before="100" w:after="100"/>
+            </w:pPr>
+            <w:r>
+              <w:rPr>
+                <w:b w:val="0"/>
+                <w:sz w:val="20"/>
+              </w:rPr>
+              <w:t>50</w:t>
+            </w:r>
+          </w:p>
+        </w:tc>
+        <w:tc>
+          <w:tcPr>
+            <w:tcW w:type="dxa" w:w="2448"/>
+            <w:tcBorders>
+              <w:top w:val="single" w:color="D9D9D9" w:sz="4"/>
+              <w:bottom w:val="single" w:color="D9D9D9" w:sz="4"/>
+              <w:left w:val="single" w:color="D9D9D9" w:sz="4"/>
+              <w:right w:val="single" w:color="D9D9D9" w:sz="4"/>
+            </w:tcBorders>
+          </w:tcPr>
+          <w:p>
+            <w:pPr>
+              <w:spacing w:before="100" w:after="100"/>
+            </w:pPr>
+            <w:r>
+              <w:rPr>
+                <w:b w:val="0"/>
+                <w:sz w:val="20"/>
+              </w:rPr>
+              <w:t>priority</w:t>
+            </w:r>
+          </w:p>
+        </w:tc>
+        <w:tc>
+          <w:tcPr>
+            <w:tcW w:type="dxa" w:w="2952"/>
+            <w:tcBorders>
+              <w:top w:val="single" w:color="D9D9D9" w:sz="4"/>
+              <w:bottom w:val="single" w:color="D9D9D9" w:sz="4"/>
+              <w:left w:val="single" w:color="D9D9D9" w:sz="4"/>
+              <w:right w:val="single" w:color="D9D9D9" w:sz="4"/>
+            </w:tcBorders>
+          </w:tcPr>
+          <w:p>
+            <w:pPr>
+              <w:spacing w:before="100" w:after="100"/>
+            </w:pPr>
+            <w:r>
+              <w:rPr>
+                <w:b w:val="0"/>
+                <w:sz w:val="20"/>
+              </w:rPr>
+              <w:t>19.35</w:t>
+            </w:r>
+          </w:p>
+        </w:tc>
+        <w:tc>
+          <w:tcPr>
+            <w:tcW w:type="dxa" w:w="2952"/>
+            <w:tcBorders>
+              <w:top w:val="single" w:color="D9D9D9" w:sz="4"/>
+              <w:bottom w:val="single" w:color="D9D9D9" w:sz="4"/>
+              <w:left w:val="single" w:color="D9D9D9" w:sz="4"/>
+              <w:right w:val="single" w:color="D9D9D9" w:sz="4"/>
+            </w:tcBorders>
+          </w:tcPr>
+          <w:p>
+            <w:pPr>
+              <w:spacing w:before="100" w:after="100"/>
+            </w:pPr>
+            <w:r>
+              <w:rPr>
+                <w:b w:val="0"/>
+                <w:sz w:val="20"/>
+              </w:rPr>
+              <w:t>35.51</w:t>
+            </w:r>
+          </w:p>
+        </w:tc>
+      </w:tr>
+      <w:tr>
+        <w:trPr>
+          <w:cantSplit/>
+        </w:trPr>
+        <w:tc>
+          <w:tcPr>
+            <w:tcW w:type="dxa" w:w="1584"/>
+            <w:tcBorders>
+              <w:top w:val="single" w:color="D9D9D9" w:sz="4"/>
+              <w:bottom w:val="single" w:color="D9D9D9" w:sz="4"/>
+              <w:left w:val="single" w:color="D9D9D9" w:sz="4"/>
+              <w:right w:val="single" w:color="D9D9D9" w:sz="4"/>
+            </w:tcBorders>
+          </w:tcPr>
+          <w:p>
+            <w:pPr>
+              <w:spacing w:before="100" w:after="100"/>
+            </w:pPr>
+            <w:r>
+              <w:rPr>
+                <w:b w:val="0"/>
+                <w:sz w:val="20"/>
+              </w:rPr>
+              <w:t>50</w:t>
+            </w:r>
+          </w:p>
+        </w:tc>
+        <w:tc>
+          <w:tcPr>
+            <w:tcW w:type="dxa" w:w="2448"/>
+            <w:tcBorders>
+              <w:top w:val="single" w:color="D9D9D9" w:sz="4"/>
+              <w:bottom w:val="single" w:color="D9D9D9" w:sz="4"/>
+              <w:left w:val="single" w:color="D9D9D9" w:sz="4"/>
+              <w:right w:val="single" w:color="D9D9D9" w:sz="4"/>
+            </w:tcBorders>
+          </w:tcPr>
+          <w:p>
+            <w:pPr>
+              <w:spacing w:before="100" w:after="100"/>
+            </w:pPr>
+            <w:r>
+              <w:rPr>
+                <w:b w:val="0"/>
+                <w:sz w:val="20"/>
+              </w:rPr>
+              <w:t>aging</w:t>
+            </w:r>
+          </w:p>
+        </w:tc>
+        <w:tc>
+          <w:tcPr>
+            <w:tcW w:type="dxa" w:w="2952"/>
+            <w:tcBorders>
+              <w:top w:val="single" w:color="D9D9D9" w:sz="4"/>
+              <w:bottom w:val="single" w:color="D9D9D9" w:sz="4"/>
+              <w:left w:val="single" w:color="D9D9D9" w:sz="4"/>
+              <w:right w:val="single" w:color="D9D9D9" w:sz="4"/>
+            </w:tcBorders>
+          </w:tcPr>
+          <w:p>
+            <w:pPr>
+              <w:spacing w:before="100" w:after="100"/>
+            </w:pPr>
+            <w:r>
+              <w:rPr>
+                <w:b w:val="0"/>
+                <w:sz w:val="20"/>
+              </w:rPr>
+              <w:t>19.35</w:t>
+            </w:r>
+          </w:p>
+        </w:tc>
+        <w:tc>
+          <w:tcPr>
+            <w:tcW w:type="dxa" w:w="2952"/>
+            <w:tcBorders>
+              <w:top w:val="single" w:color="D9D9D9" w:sz="4"/>
+              <w:bottom w:val="single" w:color="D9D9D9" w:sz="4"/>
+              <w:left w:val="single" w:color="D9D9D9" w:sz="4"/>
+              <w:right w:val="single" w:color="D9D9D9" w:sz="4"/>
+            </w:tcBorders>
+          </w:tcPr>
+          <w:p>
+            <w:pPr>
+              <w:spacing w:before="100" w:after="100"/>
+            </w:pPr>
+            <w:r>
+              <w:rPr>
+                <w:b w:val="0"/>
+                <w:sz w:val="20"/>
+              </w:rPr>
+              <w:t>35.51</w:t>
+            </w:r>
+          </w:p>
+        </w:tc>
+      </w:tr>
+      <w:tr>
+        <w:trPr>
+          <w:cantSplit/>
+        </w:trPr>
+        <w:tc>
+          <w:tcPr>
+            <w:tcW w:type="dxa" w:w="1584"/>
+            <w:tcBorders>
+              <w:top w:val="single" w:color="D9D9D9" w:sz="4"/>
+              <w:bottom w:val="single" w:color="D9D9D9" w:sz="4"/>
+              <w:left w:val="single" w:color="D9D9D9" w:sz="4"/>
+              <w:right w:val="single" w:color="D9D9D9" w:sz="4"/>
+            </w:tcBorders>
+          </w:tcPr>
+          <w:p>
+            <w:pPr>
+              <w:spacing w:before="100" w:after="100"/>
+            </w:pPr>
+            <w:r>
+              <w:rPr>
+                <w:b w:val="0"/>
+                <w:sz w:val="20"/>
+              </w:rPr>
+              <w:t>90</w:t>
+            </w:r>
+          </w:p>
+        </w:tc>
+        <w:tc>
+          <w:tcPr>
+            <w:tcW w:type="dxa" w:w="2448"/>
+            <w:tcBorders>
+              <w:top w:val="single" w:color="D9D9D9" w:sz="4"/>
+              <w:bottom w:val="single" w:color="D9D9D9" w:sz="4"/>
+              <w:left w:val="single" w:color="D9D9D9" w:sz="4"/>
+              <w:right w:val="single" w:color="D9D9D9" w:sz="4"/>
+            </w:tcBorders>
+          </w:tcPr>
+          <w:p>
+            <w:pPr>
+              <w:spacing w:before="100" w:after="100"/>
+            </w:pPr>
+            <w:r>
+              <w:rPr>
+                <w:b w:val="0"/>
+                <w:sz w:val="20"/>
+              </w:rPr>
+              <w:t>fifo</w:t>
+            </w:r>
+          </w:p>
+        </w:tc>
+        <w:tc>
+          <w:tcPr>
+            <w:tcW w:type="dxa" w:w="2952"/>
+            <w:tcBorders>
+              <w:top w:val="single" w:color="D9D9D9" w:sz="4"/>
+              <w:bottom w:val="single" w:color="D9D9D9" w:sz="4"/>
+              <w:left w:val="single" w:color="D9D9D9" w:sz="4"/>
+              <w:right w:val="single" w:color="D9D9D9" w:sz="4"/>
+            </w:tcBorders>
+          </w:tcPr>
+          <w:p>
+            <w:pPr>
+              <w:spacing w:before="100" w:after="100"/>
+            </w:pPr>
+            <w:r>
+              <w:rPr>
+                <w:b w:val="0"/>
+                <w:sz w:val="20"/>
+              </w:rPr>
+              <w:t>116.41</w:t>
+            </w:r>
+          </w:p>
+        </w:tc>
+        <w:tc>
+          <w:tcPr>
+            <w:tcW w:type="dxa" w:w="2952"/>
+            <w:tcBorders>
+              <w:top w:val="single" w:color="D9D9D9" w:sz="4"/>
+              <w:bottom w:val="single" w:color="D9D9D9" w:sz="4"/>
+              <w:left w:val="single" w:color="D9D9D9" w:sz="4"/>
+              <w:right w:val="single" w:color="D9D9D9" w:sz="4"/>
+            </w:tcBorders>
+          </w:tcPr>
+          <w:p>
+            <w:pPr>
+              <w:spacing w:before="100" w:after="100"/>
+            </w:pPr>
+            <w:r>
+              <w:rPr>
+                <w:b w:val="0"/>
+                <w:sz w:val="20"/>
+              </w:rPr>
+              <w:t>118.68</w:t>
+            </w:r>
+          </w:p>
+        </w:tc>
+      </w:tr>
+      <w:tr>
+        <w:trPr>
+          <w:cantSplit/>
+        </w:trPr>
+        <w:tc>
+          <w:tcPr>
+            <w:tcW w:type="dxa" w:w="1584"/>
+            <w:tcBorders>
+              <w:top w:val="single" w:color="D9D9D9" w:sz="4"/>
+              <w:bottom w:val="single" w:color="D9D9D9" w:sz="4"/>
+              <w:left w:val="single" w:color="D9D9D9" w:sz="4"/>
+              <w:right w:val="single" w:color="D9D9D9" w:sz="4"/>
+            </w:tcBorders>
+          </w:tcPr>
+          <w:p>
+            <w:pPr>
+              <w:spacing w:before="100" w:after="100"/>
+            </w:pPr>
+            <w:r>
+              <w:rPr>
+                <w:b w:val="0"/>
+                <w:sz w:val="20"/>
+              </w:rPr>
+              <w:t>90</w:t>
+            </w:r>
+          </w:p>
+        </w:tc>
+        <w:tc>
+          <w:tcPr>
+            <w:tcW w:type="dxa" w:w="2448"/>
+            <w:tcBorders>
+              <w:top w:val="single" w:color="D9D9D9" w:sz="4"/>
+              <w:bottom w:val="single" w:color="D9D9D9" w:sz="4"/>
+              <w:left w:val="single" w:color="D9D9D9" w:sz="4"/>
+              <w:right w:val="single" w:color="D9D9D9" w:sz="4"/>
+            </w:tcBorders>
+          </w:tcPr>
+          <w:p>
+            <w:pPr>
+              <w:spacing w:before="100" w:after="100"/>
+            </w:pPr>
+            <w:r>
+              <w:rPr>
+                <w:b w:val="0"/>
+                <w:sz w:val="20"/>
+              </w:rPr>
+              <w:t>priority</w:t>
+            </w:r>
+          </w:p>
+        </w:tc>
+        <w:tc>
+          <w:tcPr>
+            <w:tcW w:type="dxa" w:w="2952"/>
+            <w:tcBorders>
+              <w:top w:val="single" w:color="D9D9D9" w:sz="4"/>
+              <w:bottom w:val="single" w:color="D9D9D9" w:sz="4"/>
+              <w:left w:val="single" w:color="D9D9D9" w:sz="4"/>
+              <w:right w:val="single" w:color="D9D9D9" w:sz="4"/>
+            </w:tcBorders>
+          </w:tcPr>
+          <w:p>
+            <w:pPr>
+              <w:spacing w:before="100" w:after="100"/>
+            </w:pPr>
+            <w:r>
+              <w:rPr>
+                <w:b w:val="0"/>
+                <w:sz w:val="20"/>
+              </w:rPr>
+              <w:t>21.11</w:t>
+            </w:r>
+          </w:p>
+        </w:tc>
+        <w:tc>
+          <w:tcPr>
+            <w:tcW w:type="dxa" w:w="2952"/>
+            <w:tcBorders>
+              <w:top w:val="single" w:color="D9D9D9" w:sz="4"/>
+              <w:bottom w:val="single" w:color="D9D9D9" w:sz="4"/>
+              <w:left w:val="single" w:color="D9D9D9" w:sz="4"/>
+              <w:right w:val="single" w:color="D9D9D9" w:sz="4"/>
+            </w:tcBorders>
+          </w:tcPr>
+          <w:p>
+            <w:pPr>
+              <w:spacing w:before="100" w:after="100"/>
+            </w:pPr>
+            <w:r>
+              <w:rPr>
+                <w:b w:val="0"/>
+                <w:sz w:val="20"/>
+              </w:rPr>
+              <w:t>160.49</w:t>
+            </w:r>
+          </w:p>
+        </w:tc>
+      </w:tr>
+      <w:tr>
+        <w:trPr>
+          <w:cantSplit/>
+        </w:trPr>
+        <w:tc>
+          <w:tcPr>
+            <w:tcW w:type="dxa" w:w="1584"/>
+            <w:tcBorders>
+              <w:top w:val="single" w:color="D9D9D9" w:sz="4"/>
+              <w:bottom w:val="single" w:color="D9D9D9" w:sz="4"/>
+              <w:left w:val="single" w:color="D9D9D9" w:sz="4"/>
+              <w:right w:val="single" w:color="D9D9D9" w:sz="4"/>
+            </w:tcBorders>
+          </w:tcPr>
+          <w:p>
+            <w:pPr>
+              <w:spacing w:before="100" w:after="100"/>
+            </w:pPr>
+            <w:r>
+              <w:rPr>
+                <w:b w:val="0"/>
+                <w:sz w:val="20"/>
+              </w:rPr>
+              <w:t>90</w:t>
+            </w:r>
+          </w:p>
+        </w:tc>
+        <w:tc>
+          <w:tcPr>
+            <w:tcW w:type="dxa" w:w="2448"/>
+            <w:tcBorders>
+              <w:top w:val="single" w:color="D9D9D9" w:sz="4"/>
+              <w:bottom w:val="single" w:color="D9D9D9" w:sz="4"/>
+              <w:left w:val="single" w:color="D9D9D9" w:sz="4"/>
+              <w:right w:val="single" w:color="D9D9D9" w:sz="4"/>
+            </w:tcBorders>
+          </w:tcPr>
+          <w:p>
+            <w:pPr>
+              <w:spacing w:before="100" w:after="100"/>
+            </w:pPr>
+            <w:r>
+              <w:rPr>
+                <w:b w:val="0"/>
+                <w:sz w:val="20"/>
+              </w:rPr>
+              <w:t>aging</w:t>
+            </w:r>
+          </w:p>
+        </w:tc>
+        <w:tc>
+          <w:tcPr>
+            <w:tcW w:type="dxa" w:w="2952"/>
+            <w:tcBorders>
+              <w:top w:val="single" w:color="D9D9D9" w:sz="4"/>
+              <w:bottom w:val="single" w:color="D9D9D9" w:sz="4"/>
+              <w:left w:val="single" w:color="D9D9D9" w:sz="4"/>
+              <w:right w:val="single" w:color="D9D9D9" w:sz="4"/>
+            </w:tcBorders>
+          </w:tcPr>
+          <w:p>
+            <w:pPr>
+              <w:spacing w:before="100" w:after="100"/>
+            </w:pPr>
+            <w:r>
+              <w:rPr>
+                <w:b w:val="0"/>
+                <w:sz w:val="20"/>
+              </w:rPr>
+              <w:t>28.61</w:t>
+            </w:r>
+          </w:p>
+        </w:tc>
+        <w:tc>
+          <w:tcPr>
+            <w:tcW w:type="dxa" w:w="2952"/>
+            <w:tcBorders>
+              <w:top w:val="single" w:color="D9D9D9" w:sz="4"/>
+              <w:bottom w:val="single" w:color="D9D9D9" w:sz="4"/>
+              <w:left w:val="single" w:color="D9D9D9" w:sz="4"/>
+              <w:right w:val="single" w:color="D9D9D9" w:sz="4"/>
+            </w:tcBorders>
+          </w:tcPr>
+          <w:p>
+            <w:pPr>
+              <w:spacing w:before="100" w:after="100"/>
+            </w:pPr>
+            <w:r>
+              <w:rPr>
+                <w:b w:val="0"/>
+                <w:sz w:val="20"/>
+              </w:rPr>
+              <w:t>140.37</w:t>
+            </w:r>
+          </w:p>
+        </w:tc>
+      </w:tr>
+      <w:tr>
+        <w:trPr>
+          <w:cantSplit/>
+        </w:trPr>
+        <w:tc>
+          <w:tcPr>
+            <w:tcW w:type="dxa" w:w="1584"/>
+            <w:tcBorders>
+              <w:top w:val="single" w:color="D9D9D9" w:sz="4"/>
+              <w:bottom w:val="single" w:color="D9D9D9" w:sz="4"/>
+              <w:left w:val="single" w:color="D9D9D9" w:sz="4"/>
+              <w:right w:val="single" w:color="D9D9D9" w:sz="4"/>
+            </w:tcBorders>
+          </w:tcPr>
+          <w:p>
+            <w:pPr>
+              <w:spacing w:before="100" w:after="100"/>
+            </w:pPr>
+            <w:r>
+              <w:rPr>
+                <w:b w:val="0"/>
+                <w:sz w:val="20"/>
+              </w:rPr>
+              <w:t>120</w:t>
+            </w:r>
+          </w:p>
+        </w:tc>
+        <w:tc>
+          <w:tcPr>
+            <w:tcW w:type="dxa" w:w="2448"/>
+            <w:tcBorders>
+              <w:top w:val="single" w:color="D9D9D9" w:sz="4"/>
+              <w:bottom w:val="single" w:color="D9D9D9" w:sz="4"/>
+              <w:left w:val="single" w:color="D9D9D9" w:sz="4"/>
+              <w:right w:val="single" w:color="D9D9D9" w:sz="4"/>
+            </w:tcBorders>
+          </w:tcPr>
+          <w:p>
+            <w:pPr>
+              <w:spacing w:before="100" w:after="100"/>
+            </w:pPr>
+            <w:r>
+              <w:rPr>
+                <w:b w:val="0"/>
+                <w:sz w:val="20"/>
+              </w:rPr>
+              <w:t>fifo</w:t>
+            </w:r>
+          </w:p>
+        </w:tc>
+        <w:tc>
+          <w:tcPr>
+            <w:tcW w:type="dxa" w:w="2952"/>
+            <w:tcBorders>
+              <w:top w:val="single" w:color="D9D9D9" w:sz="4"/>
+              <w:bottom w:val="single" w:color="D9D9D9" w:sz="4"/>
+              <w:left w:val="single" w:color="D9D9D9" w:sz="4"/>
+              <w:right w:val="single" w:color="D9D9D9" w:sz="4"/>
+            </w:tcBorders>
+          </w:tcPr>
+          <w:p>
+            <w:pPr>
+              <w:spacing w:before="100" w:after="100"/>
+            </w:pPr>
+            <w:r>
+              <w:rPr>
+                <w:b w:val="0"/>
+                <w:sz w:val="20"/>
+              </w:rPr>
+              <w:t>1568.02</w:t>
+            </w:r>
+          </w:p>
+        </w:tc>
+        <w:tc>
+          <w:tcPr>
+            <w:tcW w:type="dxa" w:w="2952"/>
+            <w:tcBorders>
+              <w:top w:val="single" w:color="D9D9D9" w:sz="4"/>
+              <w:bottom w:val="single" w:color="D9D9D9" w:sz="4"/>
+              <w:left w:val="single" w:color="D9D9D9" w:sz="4"/>
+              <w:right w:val="single" w:color="D9D9D9" w:sz="4"/>
+            </w:tcBorders>
+          </w:tcPr>
+          <w:p>
+            <w:pPr>
+              <w:spacing w:before="100" w:after="100"/>
+            </w:pPr>
+            <w:r>
+              <w:rPr>
+                <w:b w:val="0"/>
+                <w:sz w:val="20"/>
+              </w:rPr>
+              <w:t>1604.50</w:t>
+            </w:r>
+          </w:p>
+        </w:tc>
+      </w:tr>
+      <w:tr>
+        <w:trPr>
+          <w:cantSplit/>
+        </w:trPr>
+        <w:tc>
+          <w:tcPr>
+            <w:tcW w:type="dxa" w:w="1584"/>
+            <w:tcBorders>
+              <w:top w:val="single" w:color="D9D9D9" w:sz="4"/>
+              <w:bottom w:val="single" w:color="D9D9D9" w:sz="4"/>
+              <w:left w:val="single" w:color="D9D9D9" w:sz="4"/>
+              <w:right w:val="single" w:color="D9D9D9" w:sz="4"/>
+            </w:tcBorders>
+          </w:tcPr>
+          <w:p>
+            <w:pPr>
+              <w:spacing w:before="100" w:after="100"/>
+            </w:pPr>
+            <w:r>
+              <w:rPr>
+                <w:b w:val="0"/>
+                <w:sz w:val="20"/>
+              </w:rPr>
+              <w:t>120</w:t>
+            </w:r>
+          </w:p>
+        </w:tc>
+        <w:tc>
+          <w:tcPr>
+            <w:tcW w:type="dxa" w:w="2448"/>
+            <w:tcBorders>
+              <w:top w:val="single" w:color="D9D9D9" w:sz="4"/>
+              <w:bottom w:val="single" w:color="D9D9D9" w:sz="4"/>
+              <w:left w:val="single" w:color="D9D9D9" w:sz="4"/>
+              <w:right w:val="single" w:color="D9D9D9" w:sz="4"/>
+            </w:tcBorders>
+          </w:tcPr>
+          <w:p>
+            <w:pPr>
+              <w:spacing w:before="100" w:after="100"/>
+            </w:pPr>
+            <w:r>
+              <w:rPr>
+                <w:b w:val="0"/>
+                <w:sz w:val="20"/>
+              </w:rPr>
+              <w:t>priority</w:t>
+            </w:r>
+          </w:p>
+        </w:tc>
+        <w:tc>
+          <w:tcPr>
+            <w:tcW w:type="dxa" w:w="2952"/>
+            <w:tcBorders>
+              <w:top w:val="single" w:color="D9D9D9" w:sz="4"/>
+              <w:bottom w:val="single" w:color="D9D9D9" w:sz="4"/>
+              <w:left w:val="single" w:color="D9D9D9" w:sz="4"/>
+              <w:right w:val="single" w:color="D9D9D9" w:sz="4"/>
+            </w:tcBorders>
+          </w:tcPr>
+          <w:p>
+            <w:pPr>
+              <w:spacing w:before="100" w:after="100"/>
+            </w:pPr>
+            <w:r>
+              <w:rPr>
+                <w:b w:val="0"/>
+                <w:sz w:val="20"/>
+              </w:rPr>
+              <w:t>22.67</w:t>
+            </w:r>
+          </w:p>
+        </w:tc>
+        <w:tc>
+          <w:tcPr>
+            <w:tcW w:type="dxa" w:w="2952"/>
+            <w:tcBorders>
+              <w:top w:val="single" w:color="D9D9D9" w:sz="4"/>
+              <w:bottom w:val="single" w:color="D9D9D9" w:sz="4"/>
+              <w:left w:val="single" w:color="D9D9D9" w:sz="4"/>
+              <w:right w:val="single" w:color="D9D9D9" w:sz="4"/>
+            </w:tcBorders>
+          </w:tcPr>
+          <w:p>
+            <w:pPr>
+              <w:spacing w:before="100" w:after="100"/>
+            </w:pPr>
+            <w:r>
+              <w:rPr>
+                <w:b w:val="0"/>
+                <w:sz w:val="20"/>
+              </w:rPr>
+              <w:t>1921.62</w:t>
+            </w:r>
+          </w:p>
+        </w:tc>
+      </w:tr>
+      <w:tr>
+        <w:trPr>
+          <w:cantSplit/>
+        </w:trPr>
+        <w:tc>
+          <w:tcPr>
+            <w:tcW w:type="dxa" w:w="1584"/>
+            <w:tcBorders>
+              <w:top w:val="single" w:color="D9D9D9" w:sz="4"/>
+              <w:bottom w:val="single" w:color="D9D9D9" w:sz="4"/>
+              <w:left w:val="single" w:color="D9D9D9" w:sz="4"/>
+              <w:right w:val="single" w:color="D9D9D9" w:sz="4"/>
+            </w:tcBorders>
+          </w:tcPr>
+          <w:p>
+            <w:pPr>
+              <w:spacing w:before="100" w:after="100"/>
+            </w:pPr>
+            <w:r>
+              <w:rPr>
+                <w:b w:val="0"/>
+                <w:sz w:val="20"/>
+              </w:rPr>
+              <w:t>120</w:t>
+            </w:r>
+          </w:p>
+        </w:tc>
+        <w:tc>
+          <w:tcPr>
+            <w:tcW w:type="dxa" w:w="2448"/>
+            <w:tcBorders>
+              <w:top w:val="single" w:color="D9D9D9" w:sz="4"/>
+              <w:bottom w:val="single" w:color="D9D9D9" w:sz="4"/>
+              <w:left w:val="single" w:color="D9D9D9" w:sz="4"/>
+              <w:right w:val="single" w:color="D9D9D9" w:sz="4"/>
+            </w:tcBorders>
+          </w:tcPr>
+          <w:p>
+            <w:pPr>
+              <w:spacing w:before="100" w:after="100"/>
+            </w:pPr>
+            <w:r>
+              <w:rPr>
+                <w:b w:val="0"/>
+                <w:sz w:val="20"/>
+              </w:rPr>
+              <w:t>aging</w:t>
+            </w:r>
+          </w:p>
+        </w:tc>
+        <w:tc>
+          <w:tcPr>
+            <w:tcW w:type="dxa" w:w="2952"/>
+            <w:tcBorders>
+              <w:top w:val="single" w:color="D9D9D9" w:sz="4"/>
+              <w:bottom w:val="single" w:color="D9D9D9" w:sz="4"/>
+              <w:left w:val="single" w:color="D9D9D9" w:sz="4"/>
+              <w:right w:val="single" w:color="D9D9D9" w:sz="4"/>
+            </w:tcBorders>
+          </w:tcPr>
+          <w:p>
+            <w:pPr>
+              <w:spacing w:before="100" w:after="100"/>
+            </w:pPr>
+            <w:r>
+              <w:rPr>
+                <w:b w:val="0"/>
+                <w:sz w:val="20"/>
+              </w:rPr>
+              <w:t>1568.02</w:t>
+            </w:r>
+          </w:p>
+        </w:tc>
+        <w:tc>
+          <w:tcPr>
+            <w:tcW w:type="dxa" w:w="2952"/>
+            <w:tcBorders>
+              <w:top w:val="single" w:color="D9D9D9" w:sz="4"/>
+              <w:bottom w:val="single" w:color="D9D9D9" w:sz="4"/>
+              <w:left w:val="single" w:color="D9D9D9" w:sz="4"/>
+              <w:right w:val="single" w:color="D9D9D9" w:sz="4"/>
+            </w:tcBorders>
+          </w:tcPr>
+          <w:p>
+            <w:pPr>
+              <w:spacing w:before="100" w:after="100"/>
+            </w:pPr>
+            <w:r>
+              <w:rPr>
+                <w:b w:val="0"/>
+                <w:sz w:val="20"/>
+              </w:rPr>
+              <w:t>1604.50</w:t>
+            </w:r>
+          </w:p>
+        </w:tc>
+      </w:tr>
+    </w:tbl>
+    <w:p>
+      <w:pPr>
+        <w:spacing w:after="40"/>
+      </w:pPr>
+    </w:p>
+    <w:p>
+      <w:r>
+        <w:t>Table values are means of ten run-level p95 estimates, not pooled percentiles. At 90 events/s, aging minus strict priority changes high p95 by +7.50 ms and low p95 by -20.13 ms. Exploratory paired bootstrap 95 percent intervals are [0.22, 20.94] ms and [-28.23, -11.78] ms respectively, based on 10000 resamples of ten seed pairs.</w:t>
+      </w:r>
+    </w:p>
+    <w:p>
+      <w:r>
+        <w:t>At 120 events/s, aging loses much of the urgent-latency benefit. This result motivates testing safeguards; it does not show that the proposed adaptive rule will work. The overload case is finite, not steady state. Deadlines are illustrative. With about 100 high-class samples per run, p99 estimates are unstable. Real workloads, bounded queues and live MQTT remain unvalidated.</w:t>
+      </w:r>
+    </w:p>
+    <w:p>
+      <w:r>
+        <w:t>Evidence and reproduction instructions are in evidence/pilot/. The bundle includes every run/class metric, configuration, source hashes, paired intervals and one complete compressed raw run. The runner regenerates all 90 per-event CSV files locally. No experimental result from this pilot establishes novelty.</w:t>
+      </w:r>
+    </w:p>
+    <w:p>
+      <w:pPr>
+        <w:pStyle w:val="Heading1"/>
+        <w:pageBreakBefore/>
+      </w:pPr>
+      <w:r>
+        <w:t>References for priority and delivery</w:t>
+      </w:r>
+    </w:p>
+    <w:p>
+      <w:pPr>
+        <w:pStyle w:val="Heading2"/>
+      </w:pPr>
+      <w:r>
+        <w:t>R1</w:t>
+      </w:r>
+    </w:p>
+    <w:p>
+      <w:r>
+        <w:t>Gaetano Patti; Luca Leonardi; Giuseppe Testa; Lucia Lo Bello. 2024. PrioMQTT: A prioritized version of the MQTT protocol. Computer Communications, 220, 43–51. Publisher: Elsevier. DOI: 10.1016/j.comcom.2024.03.018. https://doi.org/10.1016/j.comcom.2024.03.018</w:t>
+      </w:r>
+    </w:p>
+    <w:p>
+      <w:r>
+        <w:t>Relevance: Prioritizes time-critical traffic using a UDP-based MQTT extension.</w:t>
+      </w:r>
+    </w:p>
+    <w:p>
+      <w:pPr>
+        <w:pStyle w:val="Heading2"/>
+      </w:pPr>
+      <w:r>
+        <w:t>R2</w:t>
+      </w:r>
+    </w:p>
+    <w:p>
+      <w:r>
+        <w:t>P S Akshatha; S Divyashree; S M Dilip Kumar. 2024. Priority-enabled MQTT: a robust approach to emergency event messaging. Journal of Engineering and Applied Science, 71, article 67. Publisher: Springer Nature. DOI: 10.1186/s44147-024-00400-2. https://doi.org/10.1186/s44147-024-00400-2</w:t>
+      </w:r>
+    </w:p>
+    <w:p>
+      <w:r>
+        <w:t>Relevance: RabbitMQ virtual queues distinguish urgent, critical and FCFS messages.</w:t>
+      </w:r>
+    </w:p>
+    <w:p>
+      <w:pPr>
+        <w:pStyle w:val="Heading2"/>
+      </w:pPr>
+      <w:r>
+        <w:t>R3</w:t>
+      </w:r>
+    </w:p>
+    <w:p>
+      <w:r>
+        <w:t>Jiby J. Puthiyidam; Shelbi Joseph. 2024. PR-MQTT: a novel approach for traffic reduction and message prioritisation in IoT applications. International Journal of Web Engineering and Technology, 19(1), 44–66. Publisher: Inderscience. DOI: 10.1504/IJWET.2024.138096. https://doi.org/10.1504/IJWET.2024.138096</w:t>
+      </w:r>
+    </w:p>
+    <w:p>
+      <w:r>
+        <w:t>Relevance: Combines selective transmission and urgent-message processing in HBMQTT.</w:t>
+      </w:r>
+    </w:p>
+    <w:p>
+      <w:pPr>
+        <w:pStyle w:val="Heading2"/>
+      </w:pPr>
+      <w:r>
+        <w:t>R4</w:t>
+      </w:r>
+    </w:p>
+    <w:p>
+      <w:r>
+        <w:t>Giuseppe Testa; Luca Leonardi; Lucia Lo Bello; Gaetano Patti. 2024. Towards Integrating MQTT with Time-Sensitive Networking. 2024 IEEE 29th International Conference on Emerging Technologies and Factory Automation (ETFA). Publisher: IEEE. DOI: 10.1109/ETFA61755.2024.10710933. https://doi.org/10.1109/ETFA61755.2024.10710933</w:t>
+      </w:r>
+    </w:p>
+    <w:p>
+      <w:r>
+        <w:t>Relevance: Explores integrating PrioMQTT with TSN for traffic with diverse timing needs.</w:t>
+      </w:r>
+    </w:p>
+    <w:p>
+      <w:r>
+        <w:t>Complete verification links and access limitations are maintained in docs/related-work.md. Journal quartiles and indexing were not assessed. The candidate policy will be finalized only after full-text comparison with the closest studies.</w:t>
+      </w:r>
+    </w:p>
+    <w:p>
+      <w:pPr>
+        <w:pStyle w:val="Heading1"/>
+        <w:pageBreakBefore/>
+      </w:pPr>
+      <w:r>
+        <w:t>References for timing and fairness</w:t>
+      </w:r>
+    </w:p>
+    <w:p>
+      <w:pPr>
+        <w:pStyle w:val="Heading2"/>
+      </w:pPr>
+      <w:r>
+        <w:t>R5</w:t>
+      </w:r>
+    </w:p>
+    <w:p>
+      <w:r>
+        <w:t>Ehsan Shahri; Paulo Pedreiras; Luis Almeida. 2022. Extending MQTT with Real-Time Communication Services Based on SDN. Sensors, 22(9), article 3162. Publisher: MDPI. DOI: 10.3390/s22093162. https://doi.org/10.3390/s22093162</w:t>
+      </w:r>
+    </w:p>
+    <w:p>
+      <w:r>
+        <w:t>Relevance: Maps application timing requirements to SDN resource reservations.</w:t>
+      </w:r>
+    </w:p>
+    <w:p>
+      <w:pPr>
+        <w:pStyle w:val="Heading2"/>
+      </w:pPr>
+      <w:r>
+        <w:t>R6</w:t>
+      </w:r>
+    </w:p>
+    <w:p>
+      <w:r>
+        <w:t>Ehsan Shahri; Paulo Pedreiras; Luis Almeida. 2023. Response Time Analysis for RT-MQTT Protocol Grounded on SDN. Fourth Workshop on Next Generation Real-Time Embedded Systems (NG-RES 2023), OASIcs 108, 5:1–5:15. Publisher: Schloss Dagstuhl – Leibniz-Zentrum für Informatik. DOI: 10.4230/OASIcs.NG-RES.2023.5. https://doi.org/10.4230/OASIcs.NG-RES.2023.5</w:t>
+      </w:r>
+    </w:p>
+    <w:p>
+      <w:r>
+        <w:t>Relevance: Derives worst-case response-time analysis for an SDN-based MQTT architecture.</w:t>
+      </w:r>
+    </w:p>
+    <w:p>
+      <w:pPr>
+        <w:pStyle w:val="Heading2"/>
+      </w:pPr>
+      <w:r>
+        <w:t>R7</w:t>
+      </w:r>
+    </w:p>
+    <w:p>
+      <w:r>
+        <w:t>Kitae Hwang; Jae Moon Lee; In Hwan Jung; Dong-Hee Lee. 2019. Modification of Mosquitto Broker for Delivery of Urgent MQTT Message. 2019 IEEE Eurasia Conference on IOT, Communication and Engineering (ECICE), 166–167. Publisher: IEEE. DOI: 10.1109/ECICE47484.2019.8942800. https://doi.org/10.1109/ECICE47484.2019.8942800</w:t>
+      </w:r>
+    </w:p>
+    <w:p>
+      <w:r>
+        <w:t>Relevance: Modifies Mosquitto for urgent message delivery.</w:t>
+      </w:r>
+    </w:p>
+    <w:p>
+      <w:pPr>
+        <w:pStyle w:val="Heading2"/>
+      </w:pPr>
+      <w:r>
+        <w:t>R8</w:t>
+      </w:r>
+    </w:p>
+    <w:p>
+      <w:r>
+        <w:t>João Carlos N. Bittencourt; Paulo Portugal; Francisco Vasques; Daniel G. Costa. 2026. Multi-Tier Message Scheduling for IoT-Based Urban Emergency Systems Through Semantic Priority Override. IEEE Access, 14, 140988–141015. Publisher: IEEE. DOI: 10.1109/ACCESS.2026.3732592. https://doi.org/10.1109/ACCESS.2026.3732592</w:t>
+      </w:r>
+    </w:p>
+    <w:p>
+      <w:r>
+        <w:t>Relevance: TRIAGE/4 combines semantic alarm priority and device fairness with simulation and an MQTT prototype.</w:t>
+      </w:r>
+    </w:p>
+    <w:p>
+      <w:r>
+        <w:t>Complete verification links and access limitations are maintained in docs/related-work.md. Journal quartiles and indexing were not assessed. The candidate policy will be finalized only after full-text comparison with the closest studies.</w:t>
       </w:r>
     </w:p>
     <w:sectPr>

</xml_diff>